<commit_message>
Add reference library, engineering architecture, menu prompt, real adapted example; rewrite README
- reference/: textbook (PDF + per-experiment text), literature catalog, lecture slot, template entry
- Redrawn engineering architecture (tools/make_arch.py); fdu-lab-menu skill + prompts/menu.md (12-item menu, cost tiers)
- Example report adapted from the author's own assignment (identity removed, figures kept)
- build: copy figures for tex, native sub/superscripts; README restructured

Co-Authored-By: Claude Sonnet 5.5 <noreply@anthropic.com>
Claude-Session: https://claude.ai/code/session_01RhAjm4oyFT9JNX7xvcF7Ks
</commit_message>
<xml_diff>
--- a/examples/sample-report/report.docx
+++ b/examples/sample-report/report.docx
@@ -49,7 +49,7 @@
           <w:color w:val="000000"/>
           <w:sz w:val="52"/>
         </w:rPr>
-        <w:t>家兔高钾血症（示例·勿抄）</w:t>
+        <w:t>呼吸调节及药物影响实验报告（示例）</w:t>
       </w:r>
     </w:p>
     <w:p>
@@ -65,7 +65,7 @@
           <w:color w:val="59606A"/>
           <w:sz w:val="24"/>
         </w:rPr>
-        <w:t>实验 2.7</w:t>
+        <w:t>实验 3.1</w:t>
       </w:r>
     </w:p>
     <w:p>
@@ -78,7 +78,7 @@
         <w:drawing>
           <wp:inline>
             <wp:extent cx="2520000" cy="1697684"/>
-            <wp:docPr id="1" name="Picture 1"/>
+            <wp:docPr id="68" name="Picture 68"/>
             <wp:cNvGraphicFramePr>
               <a:graphicFrameLocks noChangeAspect="1"/>
             </wp:cNvGraphicFramePr>
@@ -131,7 +131,7 @@
           <w:color w:val="000000"/>
           <w:sz w:val="28"/>
         </w:rPr>
-        <w:t>示例班级</w:t>
+        <w:t>24 临床医学五年制</w:t>
       </w:r>
     </w:p>
     <w:p>
@@ -197,7 +197,7 @@
           <w:color w:val="59606A"/>
           <w:sz w:val="26"/>
         </w:rPr>
-        <w:t xml:space="preserve">日　期　</w:t>
+        <w:t xml:space="preserve">小　组　</w:t>
       </w:r>
       <w:r>
         <w:rPr>
@@ -206,7 +206,32 @@
           <w:color w:val="000000"/>
           <w:sz w:val="28"/>
         </w:rPr>
-        <w:t>2026.01.01</w:t>
+        <w:t>示例组</w:t>
+      </w:r>
+    </w:p>
+    <w:p>
+      <w:pPr>
+        <w:spacing w:before="0" w:after="160"/>
+        <w:ind w:firstLine="0" w:left="0" w:right="0"/>
+        <w:jc w:val="center"/>
+      </w:pPr>
+      <w:r>
+        <w:rPr>
+          <w:rFonts w:ascii="Times New Roman" w:hAnsi="Times New Roman" w:cs="Times New Roman" w:eastAsia="黑体"/>
+          <w:b w:val="0"/>
+          <w:color w:val="59606A"/>
+          <w:sz w:val="26"/>
+        </w:rPr>
+        <w:t xml:space="preserve">日　期　</w:t>
+      </w:r>
+      <w:r>
+        <w:rPr>
+          <w:rFonts w:ascii="Times New Roman" w:hAnsi="Times New Roman" w:cs="Times New Roman" w:eastAsia="宋体"/>
+          <w:b w:val="0"/>
+          <w:color w:val="000000"/>
+          <w:sz w:val="28"/>
+        </w:rPr>
+        <w:t>2026.10.15</w:t>
       </w:r>
     </w:p>
     <w:p>
@@ -257,58 +282,32 @@
         </w:sectPr>
       </w:pPr>
     </w:p>
-    <w:bookmarkStart w:id="20" w:name="摘要"/>
-    <w:p>
-      <w:pPr>
-        <w:pStyle w:val="Heading1"/>
-      </w:pPr>
-      <w:r>
-        <w:t xml:space="preserve">摘要</w:t>
-      </w:r>
-    </w:p>
     <w:p>
       <w:pPr>
         <w:pStyle w:val="BlockText"/>
       </w:pPr>
-      <w:r>
-        <w:t xml:space="preserve">本文为</w:t>
-      </w:r>
       <w:r>
         <w:rPr>
           <w:bCs/>
           <w:b/>
         </w:rPr>
-        <w:t xml:space="preserve">虚构示例</w:t>
-      </w:r>
-      <w:r>
-        <w:t xml:space="preserve">，数据由作者编造，仅用于演示排版与写作结构，请勿抄袭或当作真实结果。</w:t>
-      </w:r>
-    </w:p>
-    <w:p>
-      <w:pPr>
-        <w:pStyle w:val="FirstParagraph"/>
-      </w:pPr>
-      <w:r>
-        <w:t xml:space="preserve">观察静脉注射氯化钾对家兔心电图的影响，探讨血钾升高导致心脏兴奋性与传导性改变的机制。（示例）</w:t>
-      </w:r>
-    </w:p>
-    <w:p>
-      <w:pPr>
-        <w:pStyle w:val="BodyText"/>
-      </w:pPr>
+        <w:t xml:space="preserve">示例说明</w:t>
+      </w:r>
+      <w:r>
+        <w:t xml:space="preserve">　本例改编自作者本人的一份课程作业：姓名、学号、指导教师与组别已隐去，</w:t>
+      </w:r>
       <w:r>
         <w:rPr>
           <w:bCs/>
           <w:b/>
         </w:rPr>
-        <w:t xml:space="preserve">关键词：</w:t>
-      </w:r>
-      <w:r>
-        <w:t xml:space="preserve">高钾血症；心电图；静息电位</w:t>
-      </w:r>
-    </w:p>
-    <w:bookmarkEnd w:id="20"/>
-    <w:bookmarkStart w:id="21" w:name="引言"/>
+        <w:t xml:space="preserve">保留原始记录图与文字结构</w:t>
+      </w:r>
+      <w:r>
+        <w:t xml:space="preserve">，仅用于演示版式、写作结构与“描述性分析”的写法。请勿抄袭，请用你自己的实验记录。</w:t>
+      </w:r>
+    </w:p>
+    <w:bookmarkStart w:id="20" w:name="实验目的"/>
     <w:p>
       <w:pPr>
         <w:pStyle w:val="Heading1"/>
@@ -323,7 +322,7 @@
         <w:tab/>
       </w:r>
       <w:r>
-        <w:t xml:space="preserve">引言</w:t>
+        <w:t xml:space="preserve">实验目的</w:t>
       </w:r>
     </w:p>
     <w:p>
@@ -331,11 +330,27 @@
         <w:pStyle w:val="FirstParagraph"/>
       </w:pPr>
       <w:r>
-        <w:t xml:space="preserve">高钾血症时细胞外 K⁺ 浓度升高，细胞内外 K⁺ 浓度差减小，静息电位负值减小，心肌兴奋性先升高后降低。</w:t>
-      </w:r>
-    </w:p>
-    <w:bookmarkEnd w:id="21"/>
-    <w:bookmarkStart w:id="24" w:name="材料与方法"/>
+        <w:t xml:space="preserve">（1）学习家兔气管插管及膈肌放电记录方法，认识膈肌节律性活动与呼吸运动的关系。</w:t>
+      </w:r>
+    </w:p>
+    <w:p>
+      <w:pPr>
+        <w:pStyle w:val="BodyText"/>
+      </w:pPr>
+      <w:r>
+        <w:t xml:space="preserve">（2）观察吸入氮气、二氧化碳及注射乳酸、尼可刹米时的放电变化，理解呼吸的化学性调节与药物影响。</w:t>
+      </w:r>
+    </w:p>
+    <w:p>
+      <w:pPr>
+        <w:pStyle w:val="BodyText"/>
+      </w:pPr>
+      <w:r>
+        <w:t xml:space="preserve">（3）比较肺充气、抽气以及迷走神经切断前后的记录，分析肺牵张反射与迷走神经传入对呼吸的调节作用。</w:t>
+      </w:r>
+    </w:p>
+    <w:bookmarkEnd w:id="20"/>
+    <w:bookmarkStart w:id="25" w:name="实验方法"/>
     <w:p>
       <w:pPr>
         <w:pStyle w:val="Heading1"/>
@@ -350,10 +365,10 @@
         <w:tab/>
       </w:r>
       <w:r>
-        <w:t xml:space="preserve">材料与方法</w:t>
-      </w:r>
-    </w:p>
-    <w:bookmarkStart w:id="22" w:name="实验对象与药品"/>
+        <w:t xml:space="preserve">实验方法</w:t>
+      </w:r>
+    </w:p>
+    <w:bookmarkStart w:id="21" w:name="实验动物与记录指标"/>
     <w:p>
       <w:pPr>
         <w:pStyle w:val="Heading2"/>
@@ -368,7 +383,7 @@
         <w:tab/>
       </w:r>
       <w:r>
-        <w:t xml:space="preserve">实验对象与药品</w:t>
+        <w:t xml:space="preserve">实验动物与记录指标</w:t>
       </w:r>
     </w:p>
     <w:p>
@@ -376,11 +391,11 @@
         <w:pStyle w:val="FirstParagraph"/>
       </w:pPr>
       <w:r>
-        <w:t xml:space="preserve">家兔 1 只，体重 2.50 kg；10% KCl 溶液。</w:t>
-      </w:r>
-    </w:p>
-    <w:bookmarkEnd w:id="22"/>
-    <w:bookmarkStart w:id="23" w:name="实验步骤"/>
+        <w:t xml:space="preserve">实验对象为家兔，采用膈肌放电记录观察吸气活动。主要比较各处理时段的放电簇节律、幅度及持续情况。各截图为不同处理时段的记录，采用描述性比较，不将其作为独立动物重复进行显著性检验。</w:t>
+      </w:r>
+    </w:p>
+    <w:bookmarkEnd w:id="21"/>
+    <w:bookmarkStart w:id="22" w:name="实验药品与器材"/>
     <w:p>
       <w:pPr>
         <w:pStyle w:val="Heading2"/>
@@ -395,7 +410,7 @@
         <w:tab/>
       </w:r>
       <w:r>
-        <w:t xml:space="preserve">实验步骤</w:t>
+        <w:t xml:space="preserve">实验药品与器材</w:t>
       </w:r>
     </w:p>
     <w:p>
@@ -403,12 +418,102 @@
         <w:pStyle w:val="FirstParagraph"/>
       </w:pPr>
       <w:r>
-        <w:t xml:space="preserve">麻醉后描记正常心电图，经耳缘静脉缓慢注射 KCl，观察 T 波与 P-R 间期变化。</w:t>
+        <w:t xml:space="preserve">氮气、二氧化碳、生理盐水、乳酸及尼可刹米；哺乳动物手术器械、气管插管、注射器与橡皮管、膈肌引导电极及生物信号采集系统。麻醉、气管插管和膈肌暴露方法参照教材实验3.1[1]。</w:t>
+      </w:r>
+    </w:p>
+    <w:bookmarkEnd w:id="22"/>
+    <w:bookmarkStart w:id="23" w:name="实验操作与观察项目"/>
+    <w:p>
+      <w:pPr>
+        <w:pStyle w:val="Heading2"/>
+      </w:pPr>
+      <w:r>
+        <w:rPr>
+          <w:rStyle w:val="SectionNumber"/>
+        </w:rPr>
+        <w:t xml:space="preserve">2.3</w:t>
+      </w:r>
+      <w:r>
+        <w:tab/>
+      </w:r>
+      <w:r>
+        <w:t xml:space="preserve">实验操作与观察项目</w:t>
+      </w:r>
+    </w:p>
+    <w:p>
+      <w:pPr>
+        <w:pStyle w:val="FirstParagraph"/>
+      </w:pPr>
+      <w:r>
+        <w:t xml:space="preserve">（1）家兔麻醉、固定后建立气管通路，分离双侧颈迷走神经并穿线备用，暴露膈肌、固定引导电极，调节信号增益并记录初始曲线。</w:t>
+      </w:r>
+    </w:p>
+    <w:p>
+      <w:pPr>
+        <w:pStyle w:val="BodyText"/>
+      </w:pPr>
+      <w:r>
+        <w:t xml:space="preserve">（2）分别观察吸入氮气、二氧化碳时的记录；通过气管插管进行充气和抽气，观察肺容积改变时的放电变化。教材要求在吸气末充气、呼气末抽气，并在撤除刺激、记录稳定后进行下一项操作[1]。</w:t>
+      </w:r>
+    </w:p>
+    <w:p>
+      <w:pPr>
+        <w:pStyle w:val="BodyText"/>
+      </w:pPr>
+      <w:r>
+        <w:t xml:space="preserve">（3）比较生理盐水、乳酸及尼可刹米处理时段。教材所列标准方案为静脉注射生理盐水1</w:t>
+      </w:r>
+      <w:r>
+        <w:t xml:space="preserve"> </w:t>
+      </w:r>
+      <w:r>
+        <w:t xml:space="preserve">mL/kg、3%乳酸1～2 mL/kg、10%尼可刹米1</w:t>
+      </w:r>
+      <w:r>
+        <w:t xml:space="preserve"> </w:t>
+      </w:r>
+      <w:r>
+        <w:t xml:space="preserve">mL/kg并缓慢推注；上述为教材用量，实际给药量应以当堂操作记录为准[1]。</w:t>
+      </w:r>
+    </w:p>
+    <w:p>
+      <w:pPr>
+        <w:pStyle w:val="BodyText"/>
+      </w:pPr>
+      <w:r>
+        <w:t xml:space="preserve">（4）比较迷走神经切断前、单侧切断及双侧切断时的记录，并整理”重复抽吸”曲线。图序沿用原始资料标签，操作先后判断同时参考截图时间轴。</w:t>
       </w:r>
     </w:p>
     <w:bookmarkEnd w:id="23"/>
+    <w:bookmarkStart w:id="24" w:name="数据读取方法"/>
+    <w:p>
+      <w:pPr>
+        <w:pStyle w:val="Heading2"/>
+      </w:pPr>
+      <w:r>
+        <w:rPr>
+          <w:rStyle w:val="SectionNumber"/>
+        </w:rPr>
+        <w:t xml:space="preserve">2.4</w:t>
+      </w:r>
+      <w:r>
+        <w:tab/>
+      </w:r>
+      <w:r>
+        <w:t xml:space="preserve">数据读取方法</w:t>
+      </w:r>
+    </w:p>
+    <w:p>
+      <w:pPr>
+        <w:pStyle w:val="FirstParagraph"/>
+      </w:pPr>
+      <w:r>
+        <w:t xml:space="preserve">逐图抄录软件显示的记录时长、频率参数、最大值、最小值及峰峰值。纵轴为微伏（µV），反映电信号幅度，不能直接等同于潮气量。软件”频率”参数的测量定义未明确，故保留原读数，不直接换算为每分钟呼吸次数；节律变化依据放电簇间隔作定性比较。</w:t>
+      </w:r>
+    </w:p>
     <w:bookmarkEnd w:id="24"/>
-    <w:bookmarkStart w:id="25" w:name="结果"/>
+    <w:bookmarkEnd w:id="25"/>
+    <w:bookmarkStart w:id="69" w:name="实验结果"/>
     <w:p>
       <w:pPr>
         <w:pStyle w:val="Heading1"/>
@@ -423,7 +528,25 @@
         <w:tab/>
       </w:r>
       <w:r>
-        <w:t xml:space="preserve">结果</w:t>
+        <w:t xml:space="preserve">实验结果</w:t>
+      </w:r>
+    </w:p>
+    <w:bookmarkStart w:id="26" w:name="实验数据汇总"/>
+    <w:p>
+      <w:pPr>
+        <w:pStyle w:val="Heading2"/>
+      </w:pPr>
+      <w:r>
+        <w:rPr>
+          <w:rStyle w:val="SectionNumber"/>
+        </w:rPr>
+        <w:t xml:space="preserve">3.1</w:t>
+      </w:r>
+      <w:r>
+        <w:tab/>
+      </w:r>
+      <w:r>
+        <w:t xml:space="preserve">实验数据汇总</w:t>
       </w:r>
     </w:p>
     <w:p>
@@ -431,7 +554,7 @@
         <w:pStyle w:val="FirstParagraph"/>
       </w:pPr>
       <w:r>
-        <w:t xml:space="preserve">注射后 T 波高尖，P-R 间期延长（表 1，虚构数据）。</w:t>
+        <w:t xml:space="preserve">12个处理时段的软件读数见表1，原始曲线见图1～12。表中数据均按截图显示值记录，峰峰值采用软件直接读数，保留原显示精度。</w:t>
       </w:r>
     </w:p>
     <w:p>
@@ -443,13 +566,13 @@
           <w:bCs/>
           <w:b/>
         </w:rPr>
-        <w:t xml:space="preserve">表 1　静脉注射 KCl 前后心电图指标</w:t>
+        <w:t xml:space="preserve">表1 各处理时段原始软件读数</w:t>
       </w:r>
     </w:p>
     <w:tbl>
       <w:tblPr>
         <w:tblStyle w:val="Table"/>
-        <w:tblW w:type="auto" w:w="0"/>
+        <w:tblW w:type="pct" w:w="4875"/>
         <w:tblLook w:firstRow="1" w:lastRow="0" w:firstColumn="0" w:lastColumn="0" w:noHBand="0" w:noVBand="0" w:val="0020"/>
         <w:jc w:val="center"/>
         <w:tblBorders>
@@ -464,10 +587,12 @@
         </w:tblCellMar>
       </w:tblPr>
       <w:tblGrid>
-        <w:gridCol w:w="1980"/>
-        <w:gridCol w:w="1980"/>
-        <w:gridCol w:w="1980"/>
-        <w:gridCol w:w="1980"/>
+        <w:gridCol w:w="1782"/>
+        <w:gridCol w:w="990"/>
+        <w:gridCol w:w="1386"/>
+        <w:gridCol w:w="1188"/>
+        <w:gridCol w:w="1188"/>
+        <w:gridCol w:w="1188"/>
       </w:tblGrid>
       <w:tr>
         <w:trPr>
@@ -488,10 +613,11 @@
             </w:pPr>
             <w:r>
               <w:rPr>
+                <w:bCs/>
                 <w:b/>
                 <w:sz w:val="21"/>
               </w:rPr>
-              <w:t xml:space="preserve">时间点</w:t>
+              <w:t xml:space="preserve">处理</w:t>
             </w:r>
           </w:p>
         </w:tc>
@@ -510,10 +636,26 @@
             </w:pPr>
             <w:r>
               <w:rPr>
+                <w:bCs/>
                 <w:b/>
                 <w:sz w:val="21"/>
               </w:rPr>
-              <w:t xml:space="preserve">心率（次/分）</w:t>
+              <w:t xml:space="preserve">时长</w:t>
+            </w:r>
+            <w:r>
+              <w:rPr>
+                <w:b/>
+                <w:sz w:val="21"/>
+              </w:rPr>
+              <w:br/>
+            </w:r>
+            <w:r>
+              <w:rPr>
+                <w:bCs/>
+                <w:b/>
+                <w:sz w:val="21"/>
+              </w:rPr>
+              <w:t xml:space="preserve">（s）</w:t>
             </w:r>
           </w:p>
         </w:tc>
@@ -532,10 +674,26 @@
             </w:pPr>
             <w:r>
               <w:rPr>
+                <w:bCs/>
                 <w:b/>
                 <w:sz w:val="21"/>
               </w:rPr>
-              <w:t xml:space="preserve">P-R 间期（ms）</w:t>
+              <w:t xml:space="preserve">软件频率</w:t>
+            </w:r>
+            <w:r>
+              <w:rPr>
+                <w:b/>
+                <w:sz w:val="21"/>
+              </w:rPr>
+              <w:br/>
+            </w:r>
+            <w:r>
+              <w:rPr>
+                <w:bCs/>
+                <w:b/>
+                <w:sz w:val="21"/>
+              </w:rPr>
+              <w:t xml:space="preserve">（Hz）</w:t>
             </w:r>
           </w:p>
         </w:tc>
@@ -554,10 +712,102 @@
             </w:pPr>
             <w:r>
               <w:rPr>
+                <w:bCs/>
                 <w:b/>
                 <w:sz w:val="21"/>
               </w:rPr>
-              <w:t xml:space="preserve">T 波高度（mV）</w:t>
+              <w:t xml:space="preserve">最大值</w:t>
+            </w:r>
+            <w:r>
+              <w:rPr>
+                <w:b/>
+                <w:sz w:val="21"/>
+              </w:rPr>
+              <w:br/>
+            </w:r>
+            <w:r>
+              <w:rPr>
+                <w:bCs/>
+                <w:b/>
+                <w:sz w:val="21"/>
+              </w:rPr>
+              <w:t xml:space="preserve">（µV）</w:t>
+            </w:r>
+          </w:p>
+        </w:tc>
+        <w:tc>
+          <w:tcPr>
+            <w:tcBorders>
+              <w:bottom w:val="single" w:sz="6" w:space="0" w:color="000000"/>
+            </w:tcBorders>
+          </w:tcPr>
+          <w:p>
+            <w:pPr>
+              <w:pStyle w:val="Compact"/>
+              <w:spacing w:before="20" w:after="20" w:line="288" w:lineRule="auto"/>
+              <w:ind w:firstLine="0"/>
+              <w:jc w:val="center"/>
+            </w:pPr>
+            <w:r>
+              <w:rPr>
+                <w:bCs/>
+                <w:b/>
+                <w:sz w:val="21"/>
+              </w:rPr>
+              <w:t xml:space="preserve">最小值</w:t>
+            </w:r>
+            <w:r>
+              <w:rPr>
+                <w:b/>
+                <w:sz w:val="21"/>
+              </w:rPr>
+              <w:br/>
+            </w:r>
+            <w:r>
+              <w:rPr>
+                <w:bCs/>
+                <w:b/>
+                <w:sz w:val="21"/>
+              </w:rPr>
+              <w:t xml:space="preserve">（µV）</w:t>
+            </w:r>
+          </w:p>
+        </w:tc>
+        <w:tc>
+          <w:tcPr>
+            <w:tcBorders>
+              <w:bottom w:val="single" w:sz="6" w:space="0" w:color="000000"/>
+            </w:tcBorders>
+          </w:tcPr>
+          <w:p>
+            <w:pPr>
+              <w:pStyle w:val="Compact"/>
+              <w:spacing w:before="20" w:after="20" w:line="288" w:lineRule="auto"/>
+              <w:ind w:firstLine="0"/>
+              <w:jc w:val="center"/>
+            </w:pPr>
+            <w:r>
+              <w:rPr>
+                <w:bCs/>
+                <w:b/>
+                <w:sz w:val="21"/>
+              </w:rPr>
+              <w:t xml:space="preserve">峰峰值</w:t>
+            </w:r>
+            <w:r>
+              <w:rPr>
+                <w:b/>
+                <w:sz w:val="21"/>
+              </w:rPr>
+              <w:br/>
+            </w:r>
+            <w:r>
+              <w:rPr>
+                <w:bCs/>
+                <w:b/>
+                <w:sz w:val="21"/>
+              </w:rPr>
+              <w:t xml:space="preserve">（µV）</w:t>
             </w:r>
           </w:p>
         </w:tc>
@@ -576,58 +826,92 @@
               <w:rPr>
                 <w:sz w:val="21"/>
               </w:rPr>
-              <w:t xml:space="preserve">对照</w:t>
-            </w:r>
-          </w:p>
-        </w:tc>
-        <w:tc>
-          <w:tcPr/>
-          <w:p>
-            <w:pPr>
-              <w:pStyle w:val="Compact"/>
-              <w:spacing w:before="20" w:after="20" w:line="288" w:lineRule="auto"/>
-              <w:ind w:firstLine="0"/>
-              <w:jc w:val="center"/>
-            </w:pPr>
-            <w:r>
-              <w:rPr>
-                <w:sz w:val="21"/>
-              </w:rPr>
-              <w:t xml:space="preserve">210</w:t>
-            </w:r>
-          </w:p>
-        </w:tc>
-        <w:tc>
-          <w:tcPr/>
-          <w:p>
-            <w:pPr>
-              <w:pStyle w:val="Compact"/>
-              <w:spacing w:before="20" w:after="20" w:line="288" w:lineRule="auto"/>
-              <w:ind w:firstLine="0"/>
-              <w:jc w:val="center"/>
-            </w:pPr>
-            <w:r>
-              <w:rPr>
-                <w:sz w:val="21"/>
-              </w:rPr>
-              <w:t xml:space="preserve">60</w:t>
-            </w:r>
-          </w:p>
-        </w:tc>
-        <w:tc>
-          <w:tcPr/>
-          <w:p>
-            <w:pPr>
-              <w:pStyle w:val="Compact"/>
-              <w:spacing w:before="20" w:after="20" w:line="288" w:lineRule="auto"/>
-              <w:ind w:firstLine="0"/>
-              <w:jc w:val="center"/>
-            </w:pPr>
-            <w:r>
-              <w:rPr>
-                <w:sz w:val="21"/>
-              </w:rPr>
-              <w:t xml:space="preserve">0.15</w:t>
+              <w:t xml:space="preserve">初始</w:t>
+            </w:r>
+          </w:p>
+        </w:tc>
+        <w:tc>
+          <w:tcPr/>
+          <w:p>
+            <w:pPr>
+              <w:pStyle w:val="Compact"/>
+              <w:spacing w:before="20" w:after="20" w:line="288" w:lineRule="auto"/>
+              <w:ind w:firstLine="0"/>
+              <w:jc w:val="center"/>
+            </w:pPr>
+            <w:r>
+              <w:rPr>
+                <w:sz w:val="21"/>
+              </w:rPr>
+              <w:t xml:space="preserve">14.53</w:t>
+            </w:r>
+          </w:p>
+        </w:tc>
+        <w:tc>
+          <w:tcPr/>
+          <w:p>
+            <w:pPr>
+              <w:pStyle w:val="Compact"/>
+              <w:spacing w:before="20" w:after="20" w:line="288" w:lineRule="auto"/>
+              <w:ind w:firstLine="0"/>
+              <w:jc w:val="center"/>
+            </w:pPr>
+            <w:r>
+              <w:rPr>
+                <w:sz w:val="21"/>
+              </w:rPr>
+              <w:t xml:space="preserve">2.97</w:t>
+            </w:r>
+          </w:p>
+        </w:tc>
+        <w:tc>
+          <w:tcPr/>
+          <w:p>
+            <w:pPr>
+              <w:pStyle w:val="Compact"/>
+              <w:spacing w:before="20" w:after="20" w:line="288" w:lineRule="auto"/>
+              <w:ind w:firstLine="0"/>
+              <w:jc w:val="center"/>
+            </w:pPr>
+            <w:r>
+              <w:rPr>
+                <w:sz w:val="21"/>
+              </w:rPr>
+              <w:t xml:space="preserve">252</w:t>
+            </w:r>
+          </w:p>
+        </w:tc>
+        <w:tc>
+          <w:tcPr/>
+          <w:p>
+            <w:pPr>
+              <w:pStyle w:val="Compact"/>
+              <w:spacing w:before="20" w:after="20" w:line="288" w:lineRule="auto"/>
+              <w:ind w:firstLine="0"/>
+              <w:jc w:val="center"/>
+            </w:pPr>
+            <w:r>
+              <w:rPr>
+                <w:sz w:val="21"/>
+              </w:rPr>
+              <w:t xml:space="preserve">-353</w:t>
+            </w:r>
+          </w:p>
+        </w:tc>
+        <w:tc>
+          <w:tcPr/>
+          <w:p>
+            <w:pPr>
+              <w:pStyle w:val="Compact"/>
+              <w:spacing w:before="20" w:after="20" w:line="288" w:lineRule="auto"/>
+              <w:ind w:firstLine="0"/>
+              <w:jc w:val="center"/>
+            </w:pPr>
+            <w:r>
+              <w:rPr>
+                <w:sz w:val="21"/>
+              </w:rPr>
+              <w:t xml:space="preserve">605</w:t>
             </w:r>
           </w:p>
         </w:tc>
@@ -646,58 +930,92 @@
               <w:rPr>
                 <w:sz w:val="21"/>
               </w:rPr>
-              <w:t xml:space="preserve">注射后 2 min</w:t>
-            </w:r>
-          </w:p>
-        </w:tc>
-        <w:tc>
-          <w:tcPr/>
-          <w:p>
-            <w:pPr>
-              <w:pStyle w:val="Compact"/>
-              <w:spacing w:before="20" w:after="20" w:line="288" w:lineRule="auto"/>
-              <w:ind w:firstLine="0"/>
-              <w:jc w:val="center"/>
-            </w:pPr>
-            <w:r>
-              <w:rPr>
-                <w:sz w:val="21"/>
-              </w:rPr>
-              <w:t xml:space="preserve">180</w:t>
-            </w:r>
-          </w:p>
-        </w:tc>
-        <w:tc>
-          <w:tcPr/>
-          <w:p>
-            <w:pPr>
-              <w:pStyle w:val="Compact"/>
-              <w:spacing w:before="20" w:after="20" w:line="288" w:lineRule="auto"/>
-              <w:ind w:firstLine="0"/>
-              <w:jc w:val="center"/>
-            </w:pPr>
-            <w:r>
-              <w:rPr>
-                <w:sz w:val="21"/>
-              </w:rPr>
-              <w:t xml:space="preserve">75</w:t>
-            </w:r>
-          </w:p>
-        </w:tc>
-        <w:tc>
-          <w:tcPr/>
-          <w:p>
-            <w:pPr>
-              <w:pStyle w:val="Compact"/>
-              <w:spacing w:before="20" w:after="20" w:line="288" w:lineRule="auto"/>
-              <w:ind w:firstLine="0"/>
-              <w:jc w:val="center"/>
-            </w:pPr>
-            <w:r>
-              <w:rPr>
-                <w:sz w:val="21"/>
-              </w:rPr>
-              <w:t xml:space="preserve">0.35</w:t>
+              <w:t xml:space="preserve">吸入N₂</w:t>
+            </w:r>
+          </w:p>
+        </w:tc>
+        <w:tc>
+          <w:tcPr/>
+          <w:p>
+            <w:pPr>
+              <w:pStyle w:val="Compact"/>
+              <w:spacing w:before="20" w:after="20" w:line="288" w:lineRule="auto"/>
+              <w:ind w:firstLine="0"/>
+              <w:jc w:val="center"/>
+            </w:pPr>
+            <w:r>
+              <w:rPr>
+                <w:sz w:val="21"/>
+              </w:rPr>
+              <w:t xml:space="preserve">12.57</w:t>
+            </w:r>
+          </w:p>
+        </w:tc>
+        <w:tc>
+          <w:tcPr/>
+          <w:p>
+            <w:pPr>
+              <w:pStyle w:val="Compact"/>
+              <w:spacing w:before="20" w:after="20" w:line="288" w:lineRule="auto"/>
+              <w:ind w:firstLine="0"/>
+              <w:jc w:val="center"/>
+            </w:pPr>
+            <w:r>
+              <w:rPr>
+                <w:sz w:val="21"/>
+              </w:rPr>
+              <w:t xml:space="preserve">3.58</w:t>
+            </w:r>
+          </w:p>
+        </w:tc>
+        <w:tc>
+          <w:tcPr/>
+          <w:p>
+            <w:pPr>
+              <w:pStyle w:val="Compact"/>
+              <w:spacing w:before="20" w:after="20" w:line="288" w:lineRule="auto"/>
+              <w:ind w:firstLine="0"/>
+              <w:jc w:val="center"/>
+            </w:pPr>
+            <w:r>
+              <w:rPr>
+                <w:sz w:val="21"/>
+              </w:rPr>
+              <w:t xml:space="preserve">846</w:t>
+            </w:r>
+          </w:p>
+        </w:tc>
+        <w:tc>
+          <w:tcPr/>
+          <w:p>
+            <w:pPr>
+              <w:pStyle w:val="Compact"/>
+              <w:spacing w:before="20" w:after="20" w:line="288" w:lineRule="auto"/>
+              <w:ind w:firstLine="0"/>
+              <w:jc w:val="center"/>
+            </w:pPr>
+            <w:r>
+              <w:rPr>
+                <w:sz w:val="21"/>
+              </w:rPr>
+              <w:t xml:space="preserve">-783</w:t>
+            </w:r>
+          </w:p>
+        </w:tc>
+        <w:tc>
+          <w:tcPr/>
+          <w:p>
+            <w:pPr>
+              <w:pStyle w:val="Compact"/>
+              <w:spacing w:before="20" w:after="20" w:line="288" w:lineRule="auto"/>
+              <w:ind w:firstLine="0"/>
+              <w:jc w:val="center"/>
+            </w:pPr>
+            <w:r>
+              <w:rPr>
+                <w:sz w:val="21"/>
+              </w:rPr>
+              <w:t xml:space="preserve">1630</w:t>
             </w:r>
           </w:p>
         </w:tc>
@@ -716,65 +1034,1982 @@
               <w:rPr>
                 <w:sz w:val="21"/>
               </w:rPr>
-              <w:t xml:space="preserve">注射后 4 min</w:t>
-            </w:r>
-          </w:p>
-        </w:tc>
-        <w:tc>
-          <w:tcPr/>
-          <w:p>
-            <w:pPr>
-              <w:pStyle w:val="Compact"/>
-              <w:spacing w:before="20" w:after="20" w:line="288" w:lineRule="auto"/>
-              <w:ind w:firstLine="0"/>
-              <w:jc w:val="center"/>
-            </w:pPr>
-            <w:r>
-              <w:rPr>
-                <w:sz w:val="21"/>
-              </w:rPr>
-              <w:t xml:space="preserve">120</w:t>
-            </w:r>
-          </w:p>
-        </w:tc>
-        <w:tc>
-          <w:tcPr/>
-          <w:p>
-            <w:pPr>
-              <w:pStyle w:val="Compact"/>
-              <w:spacing w:before="20" w:after="20" w:line="288" w:lineRule="auto"/>
-              <w:ind w:firstLine="0"/>
-              <w:jc w:val="center"/>
-            </w:pPr>
-            <w:r>
-              <w:rPr>
-                <w:sz w:val="21"/>
-              </w:rPr>
-              <w:t xml:space="preserve">110</w:t>
-            </w:r>
-          </w:p>
-        </w:tc>
-        <w:tc>
-          <w:tcPr/>
-          <w:p>
-            <w:pPr>
-              <w:pStyle w:val="Compact"/>
-              <w:spacing w:before="20" w:after="20" w:line="288" w:lineRule="auto"/>
-              <w:ind w:firstLine="0"/>
-              <w:jc w:val="center"/>
-            </w:pPr>
-            <w:r>
-              <w:rPr>
-                <w:sz w:val="21"/>
-              </w:rPr>
-              <w:t xml:space="preserve">0.30</w:t>
+              <w:t xml:space="preserve">吸入CO₂</w:t>
+            </w:r>
+          </w:p>
+        </w:tc>
+        <w:tc>
+          <w:tcPr/>
+          <w:p>
+            <w:pPr>
+              <w:pStyle w:val="Compact"/>
+              <w:spacing w:before="20" w:after="20" w:line="288" w:lineRule="auto"/>
+              <w:ind w:firstLine="0"/>
+              <w:jc w:val="center"/>
+            </w:pPr>
+            <w:r>
+              <w:rPr>
+                <w:sz w:val="21"/>
+              </w:rPr>
+              <w:t xml:space="preserve">15.26</w:t>
+            </w:r>
+          </w:p>
+        </w:tc>
+        <w:tc>
+          <w:tcPr/>
+          <w:p>
+            <w:pPr>
+              <w:pStyle w:val="Compact"/>
+              <w:spacing w:before="20" w:after="20" w:line="288" w:lineRule="auto"/>
+              <w:ind w:firstLine="0"/>
+              <w:jc w:val="center"/>
+            </w:pPr>
+            <w:r>
+              <w:rPr>
+                <w:sz w:val="21"/>
+              </w:rPr>
+              <w:t xml:space="preserve">2.19</w:t>
+            </w:r>
+          </w:p>
+        </w:tc>
+        <w:tc>
+          <w:tcPr/>
+          <w:p>
+            <w:pPr>
+              <w:pStyle w:val="Compact"/>
+              <w:spacing w:before="20" w:after="20" w:line="288" w:lineRule="auto"/>
+              <w:ind w:firstLine="0"/>
+              <w:jc w:val="center"/>
+            </w:pPr>
+            <w:r>
+              <w:rPr>
+                <w:sz w:val="21"/>
+              </w:rPr>
+              <w:t xml:space="preserve">630</w:t>
+            </w:r>
+          </w:p>
+        </w:tc>
+        <w:tc>
+          <w:tcPr/>
+          <w:p>
+            <w:pPr>
+              <w:pStyle w:val="Compact"/>
+              <w:spacing w:before="20" w:after="20" w:line="288" w:lineRule="auto"/>
+              <w:ind w:firstLine="0"/>
+              <w:jc w:val="center"/>
+            </w:pPr>
+            <w:r>
+              <w:rPr>
+                <w:sz w:val="21"/>
+              </w:rPr>
+              <w:t xml:space="preserve">-730</w:t>
+            </w:r>
+          </w:p>
+        </w:tc>
+        <w:tc>
+          <w:tcPr/>
+          <w:p>
+            <w:pPr>
+              <w:pStyle w:val="Compact"/>
+              <w:spacing w:before="20" w:after="20" w:line="288" w:lineRule="auto"/>
+              <w:ind w:firstLine="0"/>
+              <w:jc w:val="center"/>
+            </w:pPr>
+            <w:r>
+              <w:rPr>
+                <w:sz w:val="21"/>
+              </w:rPr>
+              <w:t xml:space="preserve">1360</w:t>
+            </w:r>
+          </w:p>
+        </w:tc>
+      </w:tr>
+      <w:tr>
+        <w:tc>
+          <w:tcPr/>
+          <w:p>
+            <w:pPr>
+              <w:pStyle w:val="Compact"/>
+              <w:spacing w:before="20" w:after="20" w:line="288" w:lineRule="auto"/>
+              <w:ind w:firstLine="0"/>
+              <w:jc w:val="center"/>
+            </w:pPr>
+            <w:r>
+              <w:rPr>
+                <w:sz w:val="21"/>
+              </w:rPr>
+              <w:t xml:space="preserve">打气</w:t>
+            </w:r>
+          </w:p>
+        </w:tc>
+        <w:tc>
+          <w:tcPr/>
+          <w:p>
+            <w:pPr>
+              <w:pStyle w:val="Compact"/>
+              <w:spacing w:before="20" w:after="20" w:line="288" w:lineRule="auto"/>
+              <w:ind w:firstLine="0"/>
+              <w:jc w:val="center"/>
+            </w:pPr>
+            <w:r>
+              <w:rPr>
+                <w:sz w:val="21"/>
+              </w:rPr>
+              <w:t xml:space="preserve">11.15</w:t>
+            </w:r>
+          </w:p>
+        </w:tc>
+        <w:tc>
+          <w:tcPr/>
+          <w:p>
+            <w:pPr>
+              <w:pStyle w:val="Compact"/>
+              <w:spacing w:before="20" w:after="20" w:line="288" w:lineRule="auto"/>
+              <w:ind w:firstLine="0"/>
+              <w:jc w:val="center"/>
+            </w:pPr>
+            <w:r>
+              <w:rPr>
+                <w:sz w:val="21"/>
+              </w:rPr>
+              <w:t xml:space="preserve">3.19</w:t>
+            </w:r>
+          </w:p>
+        </w:tc>
+        <w:tc>
+          <w:tcPr/>
+          <w:p>
+            <w:pPr>
+              <w:pStyle w:val="Compact"/>
+              <w:spacing w:before="20" w:after="20" w:line="288" w:lineRule="auto"/>
+              <w:ind w:firstLine="0"/>
+              <w:jc w:val="center"/>
+            </w:pPr>
+            <w:r>
+              <w:rPr>
+                <w:sz w:val="21"/>
+              </w:rPr>
+              <w:t xml:space="preserve">172</w:t>
+            </w:r>
+          </w:p>
+        </w:tc>
+        <w:tc>
+          <w:tcPr/>
+          <w:p>
+            <w:pPr>
+              <w:pStyle w:val="Compact"/>
+              <w:spacing w:before="20" w:after="20" w:line="288" w:lineRule="auto"/>
+              <w:ind w:firstLine="0"/>
+              <w:jc w:val="center"/>
+            </w:pPr>
+            <w:r>
+              <w:rPr>
+                <w:sz w:val="21"/>
+              </w:rPr>
+              <w:t xml:space="preserve">-332</w:t>
+            </w:r>
+          </w:p>
+        </w:tc>
+        <w:tc>
+          <w:tcPr/>
+          <w:p>
+            <w:pPr>
+              <w:pStyle w:val="Compact"/>
+              <w:spacing w:before="20" w:after="20" w:line="288" w:lineRule="auto"/>
+              <w:ind w:firstLine="0"/>
+              <w:jc w:val="center"/>
+            </w:pPr>
+            <w:r>
+              <w:rPr>
+                <w:sz w:val="21"/>
+              </w:rPr>
+              <w:t xml:space="preserve">504</w:t>
+            </w:r>
+          </w:p>
+        </w:tc>
+      </w:tr>
+      <w:tr>
+        <w:tc>
+          <w:tcPr/>
+          <w:p>
+            <w:pPr>
+              <w:pStyle w:val="Compact"/>
+              <w:spacing w:before="20" w:after="20" w:line="288" w:lineRule="auto"/>
+              <w:ind w:firstLine="0"/>
+              <w:jc w:val="center"/>
+            </w:pPr>
+            <w:r>
+              <w:rPr>
+                <w:sz w:val="21"/>
+              </w:rPr>
+              <w:t xml:space="preserve">抽气</w:t>
+            </w:r>
+          </w:p>
+        </w:tc>
+        <w:tc>
+          <w:tcPr/>
+          <w:p>
+            <w:pPr>
+              <w:pStyle w:val="Compact"/>
+              <w:spacing w:before="20" w:after="20" w:line="288" w:lineRule="auto"/>
+              <w:ind w:firstLine="0"/>
+              <w:jc w:val="center"/>
+            </w:pPr>
+            <w:r>
+              <w:rPr>
+                <w:sz w:val="21"/>
+              </w:rPr>
+              <w:t xml:space="preserve">9.48</w:t>
+            </w:r>
+          </w:p>
+        </w:tc>
+        <w:tc>
+          <w:tcPr/>
+          <w:p>
+            <w:pPr>
+              <w:pStyle w:val="Compact"/>
+              <w:spacing w:before="20" w:after="20" w:line="288" w:lineRule="auto"/>
+              <w:ind w:firstLine="0"/>
+              <w:jc w:val="center"/>
+            </w:pPr>
+            <w:r>
+              <w:rPr>
+                <w:sz w:val="21"/>
+              </w:rPr>
+              <w:t xml:space="preserve">7.20</w:t>
+            </w:r>
+          </w:p>
+        </w:tc>
+        <w:tc>
+          <w:tcPr/>
+          <w:p>
+            <w:pPr>
+              <w:pStyle w:val="Compact"/>
+              <w:spacing w:before="20" w:after="20" w:line="288" w:lineRule="auto"/>
+              <w:ind w:firstLine="0"/>
+              <w:jc w:val="center"/>
+            </w:pPr>
+            <w:r>
+              <w:rPr>
+                <w:sz w:val="21"/>
+              </w:rPr>
+              <w:t xml:space="preserve">599</w:t>
+            </w:r>
+          </w:p>
+        </w:tc>
+        <w:tc>
+          <w:tcPr/>
+          <w:p>
+            <w:pPr>
+              <w:pStyle w:val="Compact"/>
+              <w:spacing w:before="20" w:after="20" w:line="288" w:lineRule="auto"/>
+              <w:ind w:firstLine="0"/>
+              <w:jc w:val="center"/>
+            </w:pPr>
+            <w:r>
+              <w:rPr>
+                <w:sz w:val="21"/>
+              </w:rPr>
+              <w:t xml:space="preserve">-471</w:t>
+            </w:r>
+          </w:p>
+        </w:tc>
+        <w:tc>
+          <w:tcPr/>
+          <w:p>
+            <w:pPr>
+              <w:pStyle w:val="Compact"/>
+              <w:spacing w:before="20" w:after="20" w:line="288" w:lineRule="auto"/>
+              <w:ind w:firstLine="0"/>
+              <w:jc w:val="center"/>
+            </w:pPr>
+            <w:r>
+              <w:rPr>
+                <w:sz w:val="21"/>
+              </w:rPr>
+              <w:t xml:space="preserve">1070</w:t>
+            </w:r>
+          </w:p>
+        </w:tc>
+      </w:tr>
+      <w:tr>
+        <w:tc>
+          <w:tcPr/>
+          <w:p>
+            <w:pPr>
+              <w:pStyle w:val="Compact"/>
+              <w:spacing w:before="20" w:after="20" w:line="288" w:lineRule="auto"/>
+              <w:ind w:firstLine="0"/>
+              <w:jc w:val="center"/>
+            </w:pPr>
+            <w:r>
+              <w:rPr>
+                <w:sz w:val="21"/>
+              </w:rPr>
+              <w:t xml:space="preserve">生理盐水</w:t>
+            </w:r>
+          </w:p>
+        </w:tc>
+        <w:tc>
+          <w:tcPr/>
+          <w:p>
+            <w:pPr>
+              <w:pStyle w:val="Compact"/>
+              <w:spacing w:before="20" w:after="20" w:line="288" w:lineRule="auto"/>
+              <w:ind w:firstLine="0"/>
+              <w:jc w:val="center"/>
+            </w:pPr>
+            <w:r>
+              <w:rPr>
+                <w:sz w:val="21"/>
+              </w:rPr>
+              <w:t xml:space="preserve">13.81</w:t>
+            </w:r>
+          </w:p>
+        </w:tc>
+        <w:tc>
+          <w:tcPr/>
+          <w:p>
+            <w:pPr>
+              <w:pStyle w:val="Compact"/>
+              <w:spacing w:before="20" w:after="20" w:line="288" w:lineRule="auto"/>
+              <w:ind w:firstLine="0"/>
+              <w:jc w:val="center"/>
+            </w:pPr>
+            <w:r>
+              <w:rPr>
+                <w:sz w:val="21"/>
+              </w:rPr>
+              <w:t xml:space="preserve">1.03</w:t>
+            </w:r>
+          </w:p>
+        </w:tc>
+        <w:tc>
+          <w:tcPr/>
+          <w:p>
+            <w:pPr>
+              <w:pStyle w:val="Compact"/>
+              <w:spacing w:before="20" w:after="20" w:line="288" w:lineRule="auto"/>
+              <w:ind w:firstLine="0"/>
+              <w:jc w:val="center"/>
+            </w:pPr>
+            <w:r>
+              <w:rPr>
+                <w:sz w:val="21"/>
+              </w:rPr>
+              <w:t xml:space="preserve">142</w:t>
+            </w:r>
+          </w:p>
+        </w:tc>
+        <w:tc>
+          <w:tcPr/>
+          <w:p>
+            <w:pPr>
+              <w:pStyle w:val="Compact"/>
+              <w:spacing w:before="20" w:after="20" w:line="288" w:lineRule="auto"/>
+              <w:ind w:firstLine="0"/>
+              <w:jc w:val="center"/>
+            </w:pPr>
+            <w:r>
+              <w:rPr>
+                <w:sz w:val="21"/>
+              </w:rPr>
+              <w:t xml:space="preserve">-191</w:t>
+            </w:r>
+          </w:p>
+        </w:tc>
+        <w:tc>
+          <w:tcPr/>
+          <w:p>
+            <w:pPr>
+              <w:pStyle w:val="Compact"/>
+              <w:spacing w:before="20" w:after="20" w:line="288" w:lineRule="auto"/>
+              <w:ind w:firstLine="0"/>
+              <w:jc w:val="center"/>
+            </w:pPr>
+            <w:r>
+              <w:rPr>
+                <w:sz w:val="21"/>
+              </w:rPr>
+              <w:t xml:space="preserve">332</w:t>
+            </w:r>
+          </w:p>
+        </w:tc>
+      </w:tr>
+      <w:tr>
+        <w:tc>
+          <w:tcPr/>
+          <w:p>
+            <w:pPr>
+              <w:pStyle w:val="Compact"/>
+              <w:spacing w:before="20" w:after="20" w:line="288" w:lineRule="auto"/>
+              <w:ind w:firstLine="0"/>
+              <w:jc w:val="center"/>
+            </w:pPr>
+            <w:r>
+              <w:rPr>
+                <w:sz w:val="21"/>
+              </w:rPr>
+              <w:t xml:space="preserve">乳酸</w:t>
+            </w:r>
+          </w:p>
+        </w:tc>
+        <w:tc>
+          <w:tcPr/>
+          <w:p>
+            <w:pPr>
+              <w:pStyle w:val="Compact"/>
+              <w:spacing w:before="20" w:after="20" w:line="288" w:lineRule="auto"/>
+              <w:ind w:firstLine="0"/>
+              <w:jc w:val="center"/>
+            </w:pPr>
+            <w:r>
+              <w:rPr>
+                <w:sz w:val="21"/>
+              </w:rPr>
+              <w:t xml:space="preserve">14.18</w:t>
+            </w:r>
+          </w:p>
+        </w:tc>
+        <w:tc>
+          <w:tcPr/>
+          <w:p>
+            <w:pPr>
+              <w:pStyle w:val="Compact"/>
+              <w:spacing w:before="20" w:after="20" w:line="288" w:lineRule="auto"/>
+              <w:ind w:firstLine="0"/>
+              <w:jc w:val="center"/>
+            </w:pPr>
+            <w:r>
+              <w:rPr>
+                <w:sz w:val="21"/>
+              </w:rPr>
+              <w:t xml:space="preserve">3.73</w:t>
+            </w:r>
+          </w:p>
+        </w:tc>
+        <w:tc>
+          <w:tcPr/>
+          <w:p>
+            <w:pPr>
+              <w:pStyle w:val="Compact"/>
+              <w:spacing w:before="20" w:after="20" w:line="288" w:lineRule="auto"/>
+              <w:ind w:firstLine="0"/>
+              <w:jc w:val="center"/>
+            </w:pPr>
+            <w:r>
+              <w:rPr>
+                <w:sz w:val="21"/>
+              </w:rPr>
+              <w:t xml:space="preserve">312</w:t>
+            </w:r>
+          </w:p>
+        </w:tc>
+        <w:tc>
+          <w:tcPr/>
+          <w:p>
+            <w:pPr>
+              <w:pStyle w:val="Compact"/>
+              <w:spacing w:before="20" w:after="20" w:line="288" w:lineRule="auto"/>
+              <w:ind w:firstLine="0"/>
+              <w:jc w:val="center"/>
+            </w:pPr>
+            <w:r>
+              <w:rPr>
+                <w:sz w:val="21"/>
+              </w:rPr>
+              <w:t xml:space="preserve">-361</w:t>
+            </w:r>
+          </w:p>
+        </w:tc>
+        <w:tc>
+          <w:tcPr/>
+          <w:p>
+            <w:pPr>
+              <w:pStyle w:val="Compact"/>
+              <w:spacing w:before="20" w:after="20" w:line="288" w:lineRule="auto"/>
+              <w:ind w:firstLine="0"/>
+              <w:jc w:val="center"/>
+            </w:pPr>
+            <w:r>
+              <w:rPr>
+                <w:sz w:val="21"/>
+              </w:rPr>
+              <w:t xml:space="preserve">673</w:t>
+            </w:r>
+          </w:p>
+        </w:tc>
+      </w:tr>
+      <w:tr>
+        <w:tc>
+          <w:tcPr/>
+          <w:p>
+            <w:pPr>
+              <w:pStyle w:val="Compact"/>
+              <w:spacing w:before="20" w:after="20" w:line="288" w:lineRule="auto"/>
+              <w:ind w:firstLine="0"/>
+              <w:jc w:val="center"/>
+            </w:pPr>
+            <w:r>
+              <w:rPr>
+                <w:sz w:val="21"/>
+              </w:rPr>
+              <w:t xml:space="preserve">尼可刹米</w:t>
+            </w:r>
+          </w:p>
+        </w:tc>
+        <w:tc>
+          <w:tcPr/>
+          <w:p>
+            <w:pPr>
+              <w:pStyle w:val="Compact"/>
+              <w:spacing w:before="20" w:after="20" w:line="288" w:lineRule="auto"/>
+              <w:ind w:firstLine="0"/>
+              <w:jc w:val="center"/>
+            </w:pPr>
+            <w:r>
+              <w:rPr>
+                <w:sz w:val="21"/>
+              </w:rPr>
+              <w:t xml:space="preserve">14.17</w:t>
+            </w:r>
+          </w:p>
+        </w:tc>
+        <w:tc>
+          <w:tcPr/>
+          <w:p>
+            <w:pPr>
+              <w:pStyle w:val="Compact"/>
+              <w:spacing w:before="20" w:after="20" w:line="288" w:lineRule="auto"/>
+              <w:ind w:firstLine="0"/>
+              <w:jc w:val="center"/>
+            </w:pPr>
+            <w:r>
+              <w:rPr>
+                <w:sz w:val="21"/>
+              </w:rPr>
+              <w:t xml:space="preserve">1.94</w:t>
+            </w:r>
+          </w:p>
+        </w:tc>
+        <w:tc>
+          <w:tcPr/>
+          <w:p>
+            <w:pPr>
+              <w:pStyle w:val="Compact"/>
+              <w:spacing w:before="20" w:after="20" w:line="288" w:lineRule="auto"/>
+              <w:ind w:firstLine="0"/>
+              <w:jc w:val="center"/>
+            </w:pPr>
+            <w:r>
+              <w:rPr>
+                <w:sz w:val="21"/>
+              </w:rPr>
+              <w:t xml:space="preserve">217</w:t>
+            </w:r>
+          </w:p>
+        </w:tc>
+        <w:tc>
+          <w:tcPr/>
+          <w:p>
+            <w:pPr>
+              <w:pStyle w:val="Compact"/>
+              <w:spacing w:before="20" w:after="20" w:line="288" w:lineRule="auto"/>
+              <w:ind w:firstLine="0"/>
+              <w:jc w:val="center"/>
+            </w:pPr>
+            <w:r>
+              <w:rPr>
+                <w:sz w:val="21"/>
+              </w:rPr>
+              <w:t xml:space="preserve">-266</w:t>
+            </w:r>
+          </w:p>
+        </w:tc>
+        <w:tc>
+          <w:tcPr/>
+          <w:p>
+            <w:pPr>
+              <w:pStyle w:val="Compact"/>
+              <w:spacing w:before="20" w:after="20" w:line="288" w:lineRule="auto"/>
+              <w:ind w:firstLine="0"/>
+              <w:jc w:val="center"/>
+            </w:pPr>
+            <w:r>
+              <w:rPr>
+                <w:sz w:val="21"/>
+              </w:rPr>
+              <w:t xml:space="preserve">483</w:t>
+            </w:r>
+          </w:p>
+        </w:tc>
+      </w:tr>
+      <w:tr>
+        <w:tc>
+          <w:tcPr/>
+          <w:p>
+            <w:pPr>
+              <w:pStyle w:val="Compact"/>
+              <w:spacing w:before="20" w:after="20" w:line="288" w:lineRule="auto"/>
+              <w:ind w:firstLine="0"/>
+              <w:jc w:val="center"/>
+            </w:pPr>
+            <w:r>
+              <w:rPr>
+                <w:sz w:val="21"/>
+              </w:rPr>
+              <w:t xml:space="preserve">剪断迷走前</w:t>
+            </w:r>
+          </w:p>
+        </w:tc>
+        <w:tc>
+          <w:tcPr/>
+          <w:p>
+            <w:pPr>
+              <w:pStyle w:val="Compact"/>
+              <w:spacing w:before="20" w:after="20" w:line="288" w:lineRule="auto"/>
+              <w:ind w:firstLine="0"/>
+              <w:jc w:val="center"/>
+            </w:pPr>
+            <w:r>
+              <w:rPr>
+                <w:sz w:val="21"/>
+              </w:rPr>
+              <w:t xml:space="preserve">14.24</w:t>
+            </w:r>
+          </w:p>
+        </w:tc>
+        <w:tc>
+          <w:tcPr/>
+          <w:p>
+            <w:pPr>
+              <w:pStyle w:val="Compact"/>
+              <w:spacing w:before="20" w:after="20" w:line="288" w:lineRule="auto"/>
+              <w:ind w:firstLine="0"/>
+              <w:jc w:val="center"/>
+            </w:pPr>
+            <w:r>
+              <w:rPr>
+                <w:sz w:val="21"/>
+              </w:rPr>
+              <w:t xml:space="preserve">0.81</w:t>
+            </w:r>
+          </w:p>
+        </w:tc>
+        <w:tc>
+          <w:tcPr/>
+          <w:p>
+            <w:pPr>
+              <w:pStyle w:val="Compact"/>
+              <w:spacing w:before="20" w:after="20" w:line="288" w:lineRule="auto"/>
+              <w:ind w:firstLine="0"/>
+              <w:jc w:val="center"/>
+            </w:pPr>
+            <w:r>
+              <w:rPr>
+                <w:sz w:val="21"/>
+              </w:rPr>
+              <w:t xml:space="preserve">184</w:t>
+            </w:r>
+          </w:p>
+        </w:tc>
+        <w:tc>
+          <w:tcPr/>
+          <w:p>
+            <w:pPr>
+              <w:pStyle w:val="Compact"/>
+              <w:spacing w:before="20" w:after="20" w:line="288" w:lineRule="auto"/>
+              <w:ind w:firstLine="0"/>
+              <w:jc w:val="center"/>
+            </w:pPr>
+            <w:r>
+              <w:rPr>
+                <w:sz w:val="21"/>
+              </w:rPr>
+              <w:t xml:space="preserve">-194</w:t>
+            </w:r>
+          </w:p>
+        </w:tc>
+        <w:tc>
+          <w:tcPr/>
+          <w:p>
+            <w:pPr>
+              <w:pStyle w:val="Compact"/>
+              <w:spacing w:before="20" w:after="20" w:line="288" w:lineRule="auto"/>
+              <w:ind w:firstLine="0"/>
+              <w:jc w:val="center"/>
+            </w:pPr>
+            <w:r>
+              <w:rPr>
+                <w:sz w:val="21"/>
+              </w:rPr>
+              <w:t xml:space="preserve">378</w:t>
+            </w:r>
+          </w:p>
+        </w:tc>
+      </w:tr>
+      <w:tr>
+        <w:tc>
+          <w:tcPr/>
+          <w:p>
+            <w:pPr>
+              <w:pStyle w:val="Compact"/>
+              <w:spacing w:before="20" w:after="20" w:line="288" w:lineRule="auto"/>
+              <w:ind w:firstLine="0"/>
+              <w:jc w:val="center"/>
+            </w:pPr>
+            <w:r>
+              <w:rPr>
+                <w:sz w:val="21"/>
+              </w:rPr>
+              <w:t xml:space="preserve">单侧迷走切断</w:t>
+            </w:r>
+          </w:p>
+        </w:tc>
+        <w:tc>
+          <w:tcPr/>
+          <w:p>
+            <w:pPr>
+              <w:pStyle w:val="Compact"/>
+              <w:spacing w:before="20" w:after="20" w:line="288" w:lineRule="auto"/>
+              <w:ind w:firstLine="0"/>
+              <w:jc w:val="center"/>
+            </w:pPr>
+            <w:r>
+              <w:rPr>
+                <w:sz w:val="21"/>
+              </w:rPr>
+              <w:t xml:space="preserve">14.16</w:t>
+            </w:r>
+          </w:p>
+        </w:tc>
+        <w:tc>
+          <w:tcPr/>
+          <w:p>
+            <w:pPr>
+              <w:pStyle w:val="Compact"/>
+              <w:spacing w:before="20" w:after="20" w:line="288" w:lineRule="auto"/>
+              <w:ind w:firstLine="0"/>
+              <w:jc w:val="center"/>
+            </w:pPr>
+            <w:r>
+              <w:rPr>
+                <w:sz w:val="21"/>
+              </w:rPr>
+              <w:t xml:space="preserve">2.42</w:t>
+            </w:r>
+          </w:p>
+        </w:tc>
+        <w:tc>
+          <w:tcPr/>
+          <w:p>
+            <w:pPr>
+              <w:pStyle w:val="Compact"/>
+              <w:spacing w:before="20" w:after="20" w:line="288" w:lineRule="auto"/>
+              <w:ind w:firstLine="0"/>
+              <w:jc w:val="center"/>
+            </w:pPr>
+            <w:r>
+              <w:rPr>
+                <w:sz w:val="21"/>
+              </w:rPr>
+              <w:t xml:space="preserve">268</w:t>
+            </w:r>
+          </w:p>
+        </w:tc>
+        <w:tc>
+          <w:tcPr/>
+          <w:p>
+            <w:pPr>
+              <w:pStyle w:val="Compact"/>
+              <w:spacing w:before="20" w:after="20" w:line="288" w:lineRule="auto"/>
+              <w:ind w:firstLine="0"/>
+              <w:jc w:val="center"/>
+            </w:pPr>
+            <w:r>
+              <w:rPr>
+                <w:sz w:val="21"/>
+              </w:rPr>
+              <w:t xml:space="preserve">-320</w:t>
+            </w:r>
+          </w:p>
+        </w:tc>
+        <w:tc>
+          <w:tcPr/>
+          <w:p>
+            <w:pPr>
+              <w:pStyle w:val="Compact"/>
+              <w:spacing w:before="20" w:after="20" w:line="288" w:lineRule="auto"/>
+              <w:ind w:firstLine="0"/>
+              <w:jc w:val="center"/>
+            </w:pPr>
+            <w:r>
+              <w:rPr>
+                <w:sz w:val="21"/>
+              </w:rPr>
+              <w:t xml:space="preserve">588</w:t>
+            </w:r>
+          </w:p>
+        </w:tc>
+      </w:tr>
+      <w:tr>
+        <w:tc>
+          <w:tcPr/>
+          <w:p>
+            <w:pPr>
+              <w:pStyle w:val="Compact"/>
+              <w:spacing w:before="20" w:after="20" w:line="288" w:lineRule="auto"/>
+              <w:ind w:firstLine="0"/>
+              <w:jc w:val="center"/>
+            </w:pPr>
+            <w:r>
+              <w:rPr>
+                <w:sz w:val="21"/>
+              </w:rPr>
+              <w:t xml:space="preserve">双侧迷走记录</w:t>
+            </w:r>
+          </w:p>
+        </w:tc>
+        <w:tc>
+          <w:tcPr/>
+          <w:p>
+            <w:pPr>
+              <w:pStyle w:val="Compact"/>
+              <w:spacing w:before="20" w:after="20" w:line="288" w:lineRule="auto"/>
+              <w:ind w:firstLine="0"/>
+              <w:jc w:val="center"/>
+            </w:pPr>
+            <w:r>
+              <w:rPr>
+                <w:sz w:val="21"/>
+              </w:rPr>
+              <w:t xml:space="preserve">14.33</w:t>
+            </w:r>
+          </w:p>
+        </w:tc>
+        <w:tc>
+          <w:tcPr/>
+          <w:p>
+            <w:pPr>
+              <w:pStyle w:val="Compact"/>
+              <w:spacing w:before="20" w:after="20" w:line="288" w:lineRule="auto"/>
+              <w:ind w:firstLine="0"/>
+              <w:jc w:val="center"/>
+            </w:pPr>
+            <w:r>
+              <w:rPr>
+                <w:sz w:val="21"/>
+              </w:rPr>
+              <w:t xml:space="preserve">1.46</w:t>
+            </w:r>
+          </w:p>
+        </w:tc>
+        <w:tc>
+          <w:tcPr/>
+          <w:p>
+            <w:pPr>
+              <w:pStyle w:val="Compact"/>
+              <w:spacing w:before="20" w:after="20" w:line="288" w:lineRule="auto"/>
+              <w:ind w:firstLine="0"/>
+              <w:jc w:val="center"/>
+            </w:pPr>
+            <w:r>
+              <w:rPr>
+                <w:sz w:val="21"/>
+              </w:rPr>
+              <w:t xml:space="preserve">650</w:t>
+            </w:r>
+          </w:p>
+        </w:tc>
+        <w:tc>
+          <w:tcPr/>
+          <w:p>
+            <w:pPr>
+              <w:pStyle w:val="Compact"/>
+              <w:spacing w:before="20" w:after="20" w:line="288" w:lineRule="auto"/>
+              <w:ind w:firstLine="0"/>
+              <w:jc w:val="center"/>
+            </w:pPr>
+            <w:r>
+              <w:rPr>
+                <w:sz w:val="21"/>
+              </w:rPr>
+              <w:t xml:space="preserve">-623</w:t>
+            </w:r>
+          </w:p>
+        </w:tc>
+        <w:tc>
+          <w:tcPr/>
+          <w:p>
+            <w:pPr>
+              <w:pStyle w:val="Compact"/>
+              <w:spacing w:before="20" w:after="20" w:line="288" w:lineRule="auto"/>
+              <w:ind w:firstLine="0"/>
+              <w:jc w:val="center"/>
+            </w:pPr>
+            <w:r>
+              <w:rPr>
+                <w:sz w:val="21"/>
+              </w:rPr>
+              <w:t xml:space="preserve">1273</w:t>
+            </w:r>
+          </w:p>
+        </w:tc>
+      </w:tr>
+      <w:tr>
+        <w:tc>
+          <w:tcPr/>
+          <w:p>
+            <w:pPr>
+              <w:pStyle w:val="Compact"/>
+              <w:spacing w:before="20" w:after="20" w:line="288" w:lineRule="auto"/>
+              <w:ind w:firstLine="0"/>
+              <w:jc w:val="center"/>
+            </w:pPr>
+            <w:r>
+              <w:rPr>
+                <w:sz w:val="21"/>
+              </w:rPr>
+              <w:t xml:space="preserve">重复抽吸</w:t>
+            </w:r>
+          </w:p>
+        </w:tc>
+        <w:tc>
+          <w:tcPr/>
+          <w:p>
+            <w:pPr>
+              <w:pStyle w:val="Compact"/>
+              <w:spacing w:before="20" w:after="20" w:line="288" w:lineRule="auto"/>
+              <w:ind w:firstLine="0"/>
+              <w:jc w:val="center"/>
+            </w:pPr>
+            <w:r>
+              <w:rPr>
+                <w:sz w:val="21"/>
+              </w:rPr>
+              <w:t xml:space="preserve">14.35</w:t>
+            </w:r>
+          </w:p>
+        </w:tc>
+        <w:tc>
+          <w:tcPr/>
+          <w:p>
+            <w:pPr>
+              <w:pStyle w:val="Compact"/>
+              <w:spacing w:before="20" w:after="20" w:line="288" w:lineRule="auto"/>
+              <w:ind w:firstLine="0"/>
+              <w:jc w:val="center"/>
+            </w:pPr>
+            <w:r>
+              <w:rPr>
+                <w:sz w:val="21"/>
+              </w:rPr>
+              <w:t xml:space="preserve">1.70</w:t>
+            </w:r>
+          </w:p>
+        </w:tc>
+        <w:tc>
+          <w:tcPr/>
+          <w:p>
+            <w:pPr>
+              <w:pStyle w:val="Compact"/>
+              <w:spacing w:before="20" w:after="20" w:line="288" w:lineRule="auto"/>
+              <w:ind w:firstLine="0"/>
+              <w:jc w:val="center"/>
+            </w:pPr>
+            <w:r>
+              <w:rPr>
+                <w:sz w:val="21"/>
+              </w:rPr>
+              <w:t xml:space="preserve">632</w:t>
+            </w:r>
+          </w:p>
+        </w:tc>
+        <w:tc>
+          <w:tcPr/>
+          <w:p>
+            <w:pPr>
+              <w:pStyle w:val="Compact"/>
+              <w:spacing w:before="20" w:after="20" w:line="288" w:lineRule="auto"/>
+              <w:ind w:firstLine="0"/>
+              <w:jc w:val="center"/>
+            </w:pPr>
+            <w:r>
+              <w:rPr>
+                <w:sz w:val="21"/>
+              </w:rPr>
+              <w:t xml:space="preserve">-533</w:t>
+            </w:r>
+          </w:p>
+        </w:tc>
+        <w:tc>
+          <w:tcPr/>
+          <w:p>
+            <w:pPr>
+              <w:pStyle w:val="Compact"/>
+              <w:spacing w:before="20" w:after="20" w:line="288" w:lineRule="auto"/>
+              <w:ind w:firstLine="0"/>
+              <w:jc w:val="center"/>
+            </w:pPr>
+            <w:r>
+              <w:rPr>
+                <w:sz w:val="21"/>
+              </w:rPr>
+              <w:t xml:space="preserve">1165</w:t>
             </w:r>
           </w:p>
         </w:tc>
       </w:tr>
     </w:tbl>
-    <w:bookmarkEnd w:id="25"/>
-    <w:bookmarkStart w:id="26" w:name="讨论"/>
+    <w:p>
+      <w:pPr>
+        <w:pStyle w:val="BodyText"/>
+      </w:pPr>
+      <w:r>
+        <w:t xml:space="preserve">注：软件频率读数与呼吸频率属于不同层面的指标，在缺乏测量定义和放电簇计数时不作等同解释。各时段的峰峰值反映截图内信号范围，可能受电极、增益及操作伪差影响。</w:t>
+      </w:r>
+    </w:p>
+    <w:p>
+      <w:pPr>
+        <w:pStyle w:val="BodyText"/>
+      </w:pPr>
+      <w:r>
+        <w:t xml:space="preserve">总体上，氮气和二氧化碳时段的放电幅度较初始记录增大；乳酸、尼可刹米时段的放电簇较生理盐水时段密集；双侧迷走记录较切断前呈现更大的簇状幅度和更长的簇间间隔。下面结合原始图分别描述。</w:t>
+      </w:r>
+    </w:p>
+    <w:bookmarkEnd w:id="26"/>
+    <w:bookmarkStart w:id="33" w:name="初始记录与吸入氮气"/>
+    <w:p>
+      <w:pPr>
+        <w:pStyle w:val="Heading2"/>
+      </w:pPr>
+      <w:r>
+        <w:rPr>
+          <w:rStyle w:val="SectionNumber"/>
+        </w:rPr>
+        <w:t xml:space="preserve">3.2</w:t>
+      </w:r>
+      <w:r>
+        <w:tab/>
+      </w:r>
+      <w:r>
+        <w:t xml:space="preserve">初始记录与吸入氮气</w:t>
+      </w:r>
+    </w:p>
+    <w:p>
+      <w:pPr>
+        <w:pStyle w:val="FirstParagraph"/>
+      </w:pPr>
+      <w:r>
+        <w:drawing>
+          <wp:inline>
+            <wp:extent cx="4587875" cy="2129536"/>
+            <wp:effectExtent b="0" l="0" r="0" t="0"/>
+            <wp:docPr descr="" title="" id="28" name="Picture"/>
+            <a:graphic>
+              <a:graphicData uri="http://schemas.openxmlformats.org/drawingml/2006/picture">
+                <pic:pic>
+                  <pic:nvPicPr>
+                    <pic:cNvPr descr="figures/fig1.png" id="29" name="Picture"/>
+                    <pic:cNvPicPr>
+                      <a:picLocks noChangeArrowheads="1" noChangeAspect="1"/>
+                    </pic:cNvPicPr>
+                  </pic:nvPicPr>
+                  <pic:blipFill>
+                    <a:blip r:embed="rId27"/>
+                    <a:stretch>
+                      <a:fillRect/>
+                    </a:stretch>
+                  </pic:blipFill>
+                  <pic:spPr bwMode="auto">
+                    <a:xfrm>
+                      <a:off x="0" y="0"/>
+                      <a:ext cx="4587875" cy="2129536"/>
+                    </a:xfrm>
+                    <a:prstGeom prst="rect">
+                      <a:avLst/>
+                    </a:prstGeom>
+                    <a:noFill/>
+                    <a:ln w="9525">
+                      <a:noFill/>
+                      <a:headEnd/>
+                      <a:tailEnd/>
+                    </a:ln>
+                  </pic:spPr>
+                </pic:pic>
+              </a:graphicData>
+            </a:graphic>
+          </wp:inline>
+        </w:drawing>
+      </w:r>
+    </w:p>
+    <w:p>
+      <w:pPr>
+        <w:pStyle w:val="BodyText"/>
+      </w:pPr>
+      <w:r>
+        <w:t xml:space="preserve">图1 初始记录时的原始放电曲线</w:t>
+      </w:r>
+    </w:p>
+    <w:p>
+      <w:pPr>
+        <w:pStyle w:val="BodyText"/>
+      </w:pPr>
+      <w:r>
+        <w:t xml:space="preserve">可见较规则的间歇性簇状放电，峰峰值605 µV。图中保留”AIR IN 20</w:t>
+      </w:r>
+      <w:r>
+        <w:t xml:space="preserve"> </w:t>
+      </w:r>
+      <w:r>
+        <w:t xml:space="preserve">ml”标记，因此该段作为初始记录，不能无条件视为完全未受刺激的稳定基线。</w:t>
+      </w:r>
+    </w:p>
+    <w:p>
+      <w:pPr>
+        <w:pStyle w:val="BodyText"/>
+      </w:pPr>
+      <w:r>
+        <w:drawing>
+          <wp:inline>
+            <wp:extent cx="4587875" cy="2724919"/>
+            <wp:effectExtent b="0" l="0" r="0" t="0"/>
+            <wp:docPr descr="" title="" id="31" name="Picture"/>
+            <a:graphic>
+              <a:graphicData uri="http://schemas.openxmlformats.org/drawingml/2006/picture">
+                <pic:pic>
+                  <pic:nvPicPr>
+                    <pic:cNvPr descr="figures/fig2.png" id="32" name="Picture"/>
+                    <pic:cNvPicPr>
+                      <a:picLocks noChangeArrowheads="1" noChangeAspect="1"/>
+                    </pic:cNvPicPr>
+                  </pic:nvPicPr>
+                  <pic:blipFill>
+                    <a:blip r:embed="rId30"/>
+                    <a:stretch>
+                      <a:fillRect/>
+                    </a:stretch>
+                  </pic:blipFill>
+                  <pic:spPr bwMode="auto">
+                    <a:xfrm>
+                      <a:off x="0" y="0"/>
+                      <a:ext cx="4587875" cy="2724919"/>
+                    </a:xfrm>
+                    <a:prstGeom prst="rect">
+                      <a:avLst/>
+                    </a:prstGeom>
+                    <a:noFill/>
+                    <a:ln w="9525">
+                      <a:noFill/>
+                      <a:headEnd/>
+                      <a:tailEnd/>
+                    </a:ln>
+                  </pic:spPr>
+                </pic:pic>
+              </a:graphicData>
+            </a:graphic>
+          </wp:inline>
+        </w:drawing>
+      </w:r>
+    </w:p>
+    <w:p>
+      <w:pPr>
+        <w:pStyle w:val="BodyText"/>
+      </w:pPr>
+      <w:r>
+        <w:t xml:space="preserve">图2 吸入氮气时的原始放电曲线</w:t>
+      </w:r>
+    </w:p>
+    <w:p>
+      <w:pPr>
+        <w:pStyle w:val="BodyText"/>
+      </w:pPr>
+      <w:r>
+        <w:t xml:space="preserve">放电簇幅度明显增大，峰峰值1630</w:t>
+      </w:r>
+      <w:r>
+        <w:t xml:space="preserve"> </w:t>
+      </w:r>
+      <w:r>
+        <w:t xml:space="preserve">µV；图示放电簇间隔较初始记录延长，不能据此写为呼吸频率一定增加。</w:t>
+      </w:r>
+    </w:p>
+    <w:bookmarkEnd w:id="33"/>
+    <w:bookmarkStart w:id="40" w:name="吸入二氧化碳与肺充气"/>
+    <w:p>
+      <w:pPr>
+        <w:pStyle w:val="Heading2"/>
+      </w:pPr>
+      <w:r>
+        <w:rPr>
+          <w:rStyle w:val="SectionNumber"/>
+        </w:rPr>
+        <w:t xml:space="preserve">3.3</w:t>
+      </w:r>
+      <w:r>
+        <w:tab/>
+      </w:r>
+      <w:r>
+        <w:t xml:space="preserve">吸入二氧化碳与肺充气</w:t>
+      </w:r>
+    </w:p>
+    <w:p>
+      <w:pPr>
+        <w:pStyle w:val="FirstParagraph"/>
+      </w:pPr>
+      <w:r>
+        <w:drawing>
+          <wp:inline>
+            <wp:extent cx="4587875" cy="2308623"/>
+            <wp:effectExtent b="0" l="0" r="0" t="0"/>
+            <wp:docPr descr="" title="" id="35" name="Picture"/>
+            <a:graphic>
+              <a:graphicData uri="http://schemas.openxmlformats.org/drawingml/2006/picture">
+                <pic:pic>
+                  <pic:nvPicPr>
+                    <pic:cNvPr descr="figures/fig3.png" id="36" name="Picture"/>
+                    <pic:cNvPicPr>
+                      <a:picLocks noChangeArrowheads="1" noChangeAspect="1"/>
+                    </pic:cNvPicPr>
+                  </pic:nvPicPr>
+                  <pic:blipFill>
+                    <a:blip r:embed="rId34"/>
+                    <a:stretch>
+                      <a:fillRect/>
+                    </a:stretch>
+                  </pic:blipFill>
+                  <pic:spPr bwMode="auto">
+                    <a:xfrm>
+                      <a:off x="0" y="0"/>
+                      <a:ext cx="4587875" cy="2308623"/>
+                    </a:xfrm>
+                    <a:prstGeom prst="rect">
+                      <a:avLst/>
+                    </a:prstGeom>
+                    <a:noFill/>
+                    <a:ln w="9525">
+                      <a:noFill/>
+                      <a:headEnd/>
+                      <a:tailEnd/>
+                    </a:ln>
+                  </pic:spPr>
+                </pic:pic>
+              </a:graphicData>
+            </a:graphic>
+          </wp:inline>
+        </w:drawing>
+      </w:r>
+    </w:p>
+    <w:p>
+      <w:pPr>
+        <w:pStyle w:val="BodyText"/>
+      </w:pPr>
+      <w:r>
+        <w:t xml:space="preserve">图3 吸入二氧化碳时的原始放电曲线</w:t>
+      </w:r>
+    </w:p>
+    <w:p>
+      <w:pPr>
+        <w:pStyle w:val="BodyText"/>
+      </w:pPr>
+      <w:r>
+        <w:t xml:space="preserve">放电簇仍呈周期性出现，幅度较初始记录增大，峰峰值1360</w:t>
+      </w:r>
+      <w:r>
+        <w:t xml:space="preserve"> </w:t>
+      </w:r>
+      <w:r>
+        <w:t xml:space="preserve">µV。该截图中簇间隔亦较长，幅度与节律变化应分别描述。</w:t>
+      </w:r>
+    </w:p>
+    <w:p>
+      <w:pPr>
+        <w:pStyle w:val="BodyText"/>
+      </w:pPr>
+      <w:r>
+        <w:drawing>
+          <wp:inline>
+            <wp:extent cx="4587875" cy="3009830"/>
+            <wp:effectExtent b="0" l="0" r="0" t="0"/>
+            <wp:docPr descr="" title="" id="38" name="Picture"/>
+            <a:graphic>
+              <a:graphicData uri="http://schemas.openxmlformats.org/drawingml/2006/picture">
+                <pic:pic>
+                  <pic:nvPicPr>
+                    <pic:cNvPr descr="figures/fig4.png" id="39" name="Picture"/>
+                    <pic:cNvPicPr>
+                      <a:picLocks noChangeArrowheads="1" noChangeAspect="1"/>
+                    </pic:cNvPicPr>
+                  </pic:nvPicPr>
+                  <pic:blipFill>
+                    <a:blip r:embed="rId37"/>
+                    <a:stretch>
+                      <a:fillRect/>
+                    </a:stretch>
+                  </pic:blipFill>
+                  <pic:spPr bwMode="auto">
+                    <a:xfrm>
+                      <a:off x="0" y="0"/>
+                      <a:ext cx="4587875" cy="3009830"/>
+                    </a:xfrm>
+                    <a:prstGeom prst="rect">
+                      <a:avLst/>
+                    </a:prstGeom>
+                    <a:noFill/>
+                    <a:ln w="9525">
+                      <a:noFill/>
+                      <a:headEnd/>
+                      <a:tailEnd/>
+                    </a:ln>
+                  </pic:spPr>
+                </pic:pic>
+              </a:graphicData>
+            </a:graphic>
+          </wp:inline>
+        </w:drawing>
+      </w:r>
+    </w:p>
+    <w:p>
+      <w:pPr>
+        <w:pStyle w:val="BodyText"/>
+      </w:pPr>
+      <w:r>
+        <w:t xml:space="preserve">图4 打气时的原始放电曲线</w:t>
+      </w:r>
+    </w:p>
+    <w:p>
+      <w:pPr>
+        <w:pStyle w:val="BodyText"/>
+      </w:pPr>
+      <w:r>
+        <w:t xml:space="preserve">放电簇幅度较气体处理记录小，峰峰值504</w:t>
+      </w:r>
+      <w:r>
+        <w:t xml:space="preserve"> </w:t>
+      </w:r>
+      <w:r>
+        <w:t xml:space="preserve">µV，簇间仍有放电活动。截图不足以确定注气瞬间是否发生及持续多久的呼吸暂停。</w:t>
+      </w:r>
+    </w:p>
+    <w:bookmarkEnd w:id="40"/>
+    <w:bookmarkStart w:id="47" w:name="抽气与生理盐水"/>
+    <w:p>
+      <w:pPr>
+        <w:pStyle w:val="Heading2"/>
+      </w:pPr>
+      <w:r>
+        <w:rPr>
+          <w:rStyle w:val="SectionNumber"/>
+        </w:rPr>
+        <w:t xml:space="preserve">3.4</w:t>
+      </w:r>
+      <w:r>
+        <w:tab/>
+      </w:r>
+      <w:r>
+        <w:t xml:space="preserve">抽气与生理盐水</w:t>
+      </w:r>
+    </w:p>
+    <w:p>
+      <w:pPr>
+        <w:pStyle w:val="FirstParagraph"/>
+      </w:pPr>
+      <w:r>
+        <w:drawing>
+          <wp:inline>
+            <wp:extent cx="4587875" cy="3443107"/>
+            <wp:effectExtent b="0" l="0" r="0" t="0"/>
+            <wp:docPr descr="" title="" id="42" name="Picture"/>
+            <a:graphic>
+              <a:graphicData uri="http://schemas.openxmlformats.org/drawingml/2006/picture">
+                <pic:pic>
+                  <pic:nvPicPr>
+                    <pic:cNvPr descr="figures/fig5.png" id="43" name="Picture"/>
+                    <pic:cNvPicPr>
+                      <a:picLocks noChangeArrowheads="1" noChangeAspect="1"/>
+                    </pic:cNvPicPr>
+                  </pic:nvPicPr>
+                  <pic:blipFill>
+                    <a:blip r:embed="rId41"/>
+                    <a:stretch>
+                      <a:fillRect/>
+                    </a:stretch>
+                  </pic:blipFill>
+                  <pic:spPr bwMode="auto">
+                    <a:xfrm>
+                      <a:off x="0" y="0"/>
+                      <a:ext cx="4587875" cy="3443107"/>
+                    </a:xfrm>
+                    <a:prstGeom prst="rect">
+                      <a:avLst/>
+                    </a:prstGeom>
+                    <a:noFill/>
+                    <a:ln w="9525">
+                      <a:noFill/>
+                      <a:headEnd/>
+                      <a:tailEnd/>
+                    </a:ln>
+                  </pic:spPr>
+                </pic:pic>
+              </a:graphicData>
+            </a:graphic>
+          </wp:inline>
+        </w:drawing>
+      </w:r>
+    </w:p>
+    <w:p>
+      <w:pPr>
+        <w:pStyle w:val="BodyText"/>
+      </w:pPr>
+      <w:r>
+        <w:t xml:space="preserve">图5 抽气时的原始放电曲线</w:t>
+      </w:r>
+    </w:p>
+    <w:p>
+      <w:pPr>
+        <w:pStyle w:val="BodyText"/>
+      </w:pPr>
+      <w:r>
+        <w:t xml:space="preserve">前段出现较高尖峰，随后可见连续簇状放电，峰峰值1070</w:t>
+      </w:r>
+      <w:r>
+        <w:t xml:space="preserve"> </w:t>
+      </w:r>
+      <w:r>
+        <w:t xml:space="preserve">µV。前端尖峰可能混有操作伪差，应与稳定放电簇区别观察。</w:t>
+      </w:r>
+    </w:p>
+    <w:p>
+      <w:pPr>
+        <w:pStyle w:val="BodyText"/>
+      </w:pPr>
+      <w:r>
+        <w:drawing>
+          <wp:inline>
+            <wp:extent cx="4587875" cy="2461002"/>
+            <wp:effectExtent b="0" l="0" r="0" t="0"/>
+            <wp:docPr descr="" title="" id="45" name="Picture"/>
+            <a:graphic>
+              <a:graphicData uri="http://schemas.openxmlformats.org/drawingml/2006/picture">
+                <pic:pic>
+                  <pic:nvPicPr>
+                    <pic:cNvPr descr="figures/fig6.png" id="46" name="Picture"/>
+                    <pic:cNvPicPr>
+                      <a:picLocks noChangeArrowheads="1" noChangeAspect="1"/>
+                    </pic:cNvPicPr>
+                  </pic:nvPicPr>
+                  <pic:blipFill>
+                    <a:blip r:embed="rId44"/>
+                    <a:stretch>
+                      <a:fillRect/>
+                    </a:stretch>
+                  </pic:blipFill>
+                  <pic:spPr bwMode="auto">
+                    <a:xfrm>
+                      <a:off x="0" y="0"/>
+                      <a:ext cx="4587875" cy="2461002"/>
+                    </a:xfrm>
+                    <a:prstGeom prst="rect">
+                      <a:avLst/>
+                    </a:prstGeom>
+                    <a:noFill/>
+                    <a:ln w="9525">
+                      <a:noFill/>
+                      <a:headEnd/>
+                      <a:tailEnd/>
+                    </a:ln>
+                  </pic:spPr>
+                </pic:pic>
+              </a:graphicData>
+            </a:graphic>
+          </wp:inline>
+        </w:drawing>
+      </w:r>
+    </w:p>
+    <w:p>
+      <w:pPr>
+        <w:pStyle w:val="BodyText"/>
+      </w:pPr>
+      <w:r>
+        <w:t xml:space="preserve">图6 生理盐水时的原始放电曲线</w:t>
+      </w:r>
+    </w:p>
+    <w:p>
+      <w:pPr>
+        <w:pStyle w:val="BodyText"/>
+      </w:pPr>
+      <w:r>
+        <w:t xml:space="preserve">簇状放电较规则、幅度较小，峰峰值332 µV，可作为药物观察阶段的参照记录。</w:t>
+      </w:r>
+    </w:p>
+    <w:bookmarkEnd w:id="47"/>
+    <w:bookmarkStart w:id="54" w:name="乳酸与尼可刹米"/>
+    <w:p>
+      <w:pPr>
+        <w:pStyle w:val="Heading2"/>
+      </w:pPr>
+      <w:r>
+        <w:rPr>
+          <w:rStyle w:val="SectionNumber"/>
+        </w:rPr>
+        <w:t xml:space="preserve">3.5</w:t>
+      </w:r>
+      <w:r>
+        <w:tab/>
+      </w:r>
+      <w:r>
+        <w:t xml:space="preserve">乳酸与尼可刹米</w:t>
+      </w:r>
+    </w:p>
+    <w:p>
+      <w:pPr>
+        <w:pStyle w:val="FirstParagraph"/>
+      </w:pPr>
+      <w:r>
+        <w:drawing>
+          <wp:inline>
+            <wp:extent cx="4587875" cy="2387823"/>
+            <wp:effectExtent b="0" l="0" r="0" t="0"/>
+            <wp:docPr descr="" title="" id="49" name="Picture"/>
+            <a:graphic>
+              <a:graphicData uri="http://schemas.openxmlformats.org/drawingml/2006/picture">
+                <pic:pic>
+                  <pic:nvPicPr>
+                    <pic:cNvPr descr="figures/fig7.png" id="50" name="Picture"/>
+                    <pic:cNvPicPr>
+                      <a:picLocks noChangeArrowheads="1" noChangeAspect="1"/>
+                    </pic:cNvPicPr>
+                  </pic:nvPicPr>
+                  <pic:blipFill>
+                    <a:blip r:embed="rId48"/>
+                    <a:stretch>
+                      <a:fillRect/>
+                    </a:stretch>
+                  </pic:blipFill>
+                  <pic:spPr bwMode="auto">
+                    <a:xfrm>
+                      <a:off x="0" y="0"/>
+                      <a:ext cx="4587875" cy="2387823"/>
+                    </a:xfrm>
+                    <a:prstGeom prst="rect">
+                      <a:avLst/>
+                    </a:prstGeom>
+                    <a:noFill/>
+                    <a:ln w="9525">
+                      <a:noFill/>
+                      <a:headEnd/>
+                      <a:tailEnd/>
+                    </a:ln>
+                  </pic:spPr>
+                </pic:pic>
+              </a:graphicData>
+            </a:graphic>
+          </wp:inline>
+        </w:drawing>
+      </w:r>
+    </w:p>
+    <w:p>
+      <w:pPr>
+        <w:pStyle w:val="BodyText"/>
+      </w:pPr>
+      <w:r>
+        <w:t xml:space="preserve">图7 乳酸时的原始放电曲线</w:t>
+      </w:r>
+    </w:p>
+    <w:p>
+      <w:pPr>
+        <w:pStyle w:val="BodyText"/>
+      </w:pPr>
+      <w:r>
+        <w:t xml:space="preserve">放电簇较生理盐水时段密集，峰峰值673</w:t>
+      </w:r>
+      <w:r>
+        <w:t xml:space="preserve"> </w:t>
+      </w:r>
+      <w:r>
+        <w:t xml:space="preserve">µV，提示该时段吸气相关电活动较参照记录增强。</w:t>
+      </w:r>
+    </w:p>
+    <w:p>
+      <w:pPr>
+        <w:pStyle w:val="BodyText"/>
+      </w:pPr>
+      <w:r>
+        <w:drawing>
+          <wp:inline>
+            <wp:extent cx="4587875" cy="2468220"/>
+            <wp:effectExtent b="0" l="0" r="0" t="0"/>
+            <wp:docPr descr="" title="" id="52" name="Picture"/>
+            <a:graphic>
+              <a:graphicData uri="http://schemas.openxmlformats.org/drawingml/2006/picture">
+                <pic:pic>
+                  <pic:nvPicPr>
+                    <pic:cNvPr descr="figures/fig8.png" id="53" name="Picture"/>
+                    <pic:cNvPicPr>
+                      <a:picLocks noChangeArrowheads="1" noChangeAspect="1"/>
+                    </pic:cNvPicPr>
+                  </pic:nvPicPr>
+                  <pic:blipFill>
+                    <a:blip r:embed="rId51"/>
+                    <a:stretch>
+                      <a:fillRect/>
+                    </a:stretch>
+                  </pic:blipFill>
+                  <pic:spPr bwMode="auto">
+                    <a:xfrm>
+                      <a:off x="0" y="0"/>
+                      <a:ext cx="4587875" cy="2468220"/>
+                    </a:xfrm>
+                    <a:prstGeom prst="rect">
+                      <a:avLst/>
+                    </a:prstGeom>
+                    <a:noFill/>
+                    <a:ln w="9525">
+                      <a:noFill/>
+                      <a:headEnd/>
+                      <a:tailEnd/>
+                    </a:ln>
+                  </pic:spPr>
+                </pic:pic>
+              </a:graphicData>
+            </a:graphic>
+          </wp:inline>
+        </w:drawing>
+      </w:r>
+    </w:p>
+    <w:p>
+      <w:pPr>
+        <w:pStyle w:val="BodyText"/>
+      </w:pPr>
+      <w:r>
+        <w:t xml:space="preserve">图8 尼可刹米时的原始放电曲线</w:t>
+      </w:r>
+    </w:p>
+    <w:p>
+      <w:pPr>
+        <w:pStyle w:val="BodyText"/>
+      </w:pPr>
+      <w:r>
+        <w:t xml:space="preserve">保持较密集的簇状活动，峰峰值483</w:t>
+      </w:r>
+      <w:r>
+        <w:t xml:space="preserve"> </w:t>
+      </w:r>
+      <w:r>
+        <w:t xml:space="preserve">µV，高于生理盐水时段，但低于乳酸时段；不能仅凭两张截图判定药物效力的大小。</w:t>
+      </w:r>
+    </w:p>
+    <w:bookmarkEnd w:id="54"/>
+    <w:bookmarkStart w:id="61" w:name="迷走神经切断前与单侧切断"/>
+    <w:p>
+      <w:pPr>
+        <w:pStyle w:val="Heading2"/>
+      </w:pPr>
+      <w:r>
+        <w:rPr>
+          <w:rStyle w:val="SectionNumber"/>
+        </w:rPr>
+        <w:t xml:space="preserve">3.6</w:t>
+      </w:r>
+      <w:r>
+        <w:tab/>
+      </w:r>
+      <w:r>
+        <w:t xml:space="preserve">迷走神经切断前与单侧切断</w:t>
+      </w:r>
+    </w:p>
+    <w:p>
+      <w:pPr>
+        <w:pStyle w:val="FirstParagraph"/>
+      </w:pPr>
+      <w:r>
+        <w:drawing>
+          <wp:inline>
+            <wp:extent cx="4587875" cy="2370558"/>
+            <wp:effectExtent b="0" l="0" r="0" t="0"/>
+            <wp:docPr descr="" title="" id="56" name="Picture"/>
+            <a:graphic>
+              <a:graphicData uri="http://schemas.openxmlformats.org/drawingml/2006/picture">
+                <pic:pic>
+                  <pic:nvPicPr>
+                    <pic:cNvPr descr="figures/fig9.png" id="57" name="Picture"/>
+                    <pic:cNvPicPr>
+                      <a:picLocks noChangeArrowheads="1" noChangeAspect="1"/>
+                    </pic:cNvPicPr>
+                  </pic:nvPicPr>
+                  <pic:blipFill>
+                    <a:blip r:embed="rId55"/>
+                    <a:stretch>
+                      <a:fillRect/>
+                    </a:stretch>
+                  </pic:blipFill>
+                  <pic:spPr bwMode="auto">
+                    <a:xfrm>
+                      <a:off x="0" y="0"/>
+                      <a:ext cx="4587875" cy="2370558"/>
+                    </a:xfrm>
+                    <a:prstGeom prst="rect">
+                      <a:avLst/>
+                    </a:prstGeom>
+                    <a:noFill/>
+                    <a:ln w="9525">
+                      <a:noFill/>
+                      <a:headEnd/>
+                      <a:tailEnd/>
+                    </a:ln>
+                  </pic:spPr>
+                </pic:pic>
+              </a:graphicData>
+            </a:graphic>
+          </wp:inline>
+        </w:drawing>
+      </w:r>
+    </w:p>
+    <w:p>
+      <w:pPr>
+        <w:pStyle w:val="BodyText"/>
+      </w:pPr>
+      <w:r>
+        <w:t xml:space="preserve">图9 剪断迷走神经前时的原始放电曲线</w:t>
+      </w:r>
+    </w:p>
+    <w:p>
+      <w:pPr>
+        <w:pStyle w:val="BodyText"/>
+      </w:pPr>
+      <w:r>
+        <w:t xml:space="preserve">簇状活动较规则，峰峰值378 µV，为迷走神经处理阶段的参照记录。</w:t>
+      </w:r>
+    </w:p>
+    <w:p>
+      <w:pPr>
+        <w:pStyle w:val="BodyText"/>
+      </w:pPr>
+      <w:r>
+        <w:drawing>
+          <wp:inline>
+            <wp:extent cx="4587875" cy="2469910"/>
+            <wp:effectExtent b="0" l="0" r="0" t="0"/>
+            <wp:docPr descr="" title="" id="59" name="Picture"/>
+            <a:graphic>
+              <a:graphicData uri="http://schemas.openxmlformats.org/drawingml/2006/picture">
+                <pic:pic>
+                  <pic:nvPicPr>
+                    <pic:cNvPr descr="figures/fig10.png" id="60" name="Picture"/>
+                    <pic:cNvPicPr>
+                      <a:picLocks noChangeArrowheads="1" noChangeAspect="1"/>
+                    </pic:cNvPicPr>
+                  </pic:nvPicPr>
+                  <pic:blipFill>
+                    <a:blip r:embed="rId58"/>
+                    <a:stretch>
+                      <a:fillRect/>
+                    </a:stretch>
+                  </pic:blipFill>
+                  <pic:spPr bwMode="auto">
+                    <a:xfrm>
+                      <a:off x="0" y="0"/>
+                      <a:ext cx="4587875" cy="2469910"/>
+                    </a:xfrm>
+                    <a:prstGeom prst="rect">
+                      <a:avLst/>
+                    </a:prstGeom>
+                    <a:noFill/>
+                    <a:ln w="9525">
+                      <a:noFill/>
+                      <a:headEnd/>
+                      <a:tailEnd/>
+                    </a:ln>
+                  </pic:spPr>
+                </pic:pic>
+              </a:graphicData>
+            </a:graphic>
+          </wp:inline>
+        </w:drawing>
+      </w:r>
+    </w:p>
+    <w:p>
+      <w:pPr>
+        <w:pStyle w:val="BodyText"/>
+      </w:pPr>
+      <w:r>
+        <w:t xml:space="preserve">图10 剪断单侧迷走神经时的原始放电曲线</w:t>
+      </w:r>
+    </w:p>
+    <w:p>
+      <w:pPr>
+        <w:pStyle w:val="BodyText"/>
+      </w:pPr>
+      <w:r>
+        <w:t xml:space="preserve">放电簇幅度较切断前增大，峰峰值588</w:t>
+      </w:r>
+      <w:r>
+        <w:t xml:space="preserve"> </w:t>
+      </w:r>
+      <w:r>
+        <w:t xml:space="preserve">µV，簇间低幅活动有所增加，仍保留较规则的节律。</w:t>
+      </w:r>
+    </w:p>
+    <w:bookmarkEnd w:id="61"/>
+    <w:bookmarkStart w:id="68" w:name="双侧迷走记录与重复抽吸"/>
+    <w:p>
+      <w:pPr>
+        <w:pStyle w:val="Heading2"/>
+      </w:pPr>
+      <w:r>
+        <w:rPr>
+          <w:rStyle w:val="SectionNumber"/>
+        </w:rPr>
+        <w:t xml:space="preserve">3.7</w:t>
+      </w:r>
+      <w:r>
+        <w:tab/>
+      </w:r>
+      <w:r>
+        <w:t xml:space="preserve">双侧迷走记录与重复抽吸</w:t>
+      </w:r>
+    </w:p>
+    <w:p>
+      <w:pPr>
+        <w:pStyle w:val="FirstParagraph"/>
+      </w:pPr>
+      <w:r>
+        <w:drawing>
+          <wp:inline>
+            <wp:extent cx="4587875" cy="2351324"/>
+            <wp:effectExtent b="0" l="0" r="0" t="0"/>
+            <wp:docPr descr="" title="" id="63" name="Picture"/>
+            <a:graphic>
+              <a:graphicData uri="http://schemas.openxmlformats.org/drawingml/2006/picture">
+                <pic:pic>
+                  <pic:nvPicPr>
+                    <pic:cNvPr descr="figures/fig11.png" id="64" name="Picture"/>
+                    <pic:cNvPicPr>
+                      <a:picLocks noChangeArrowheads="1" noChangeAspect="1"/>
+                    </pic:cNvPicPr>
+                  </pic:nvPicPr>
+                  <pic:blipFill>
+                    <a:blip r:embed="rId62"/>
+                    <a:stretch>
+                      <a:fillRect/>
+                    </a:stretch>
+                  </pic:blipFill>
+                  <pic:spPr bwMode="auto">
+                    <a:xfrm>
+                      <a:off x="0" y="0"/>
+                      <a:ext cx="4587875" cy="2351324"/>
+                    </a:xfrm>
+                    <a:prstGeom prst="rect">
+                      <a:avLst/>
+                    </a:prstGeom>
+                    <a:noFill/>
+                    <a:ln w="9525">
+                      <a:noFill/>
+                      <a:headEnd/>
+                      <a:tailEnd/>
+                    </a:ln>
+                  </pic:spPr>
+                </pic:pic>
+              </a:graphicData>
+            </a:graphic>
+          </wp:inline>
+        </w:drawing>
+      </w:r>
+    </w:p>
+    <w:p>
+      <w:pPr>
+        <w:pStyle w:val="BodyText"/>
+      </w:pPr>
+      <w:r>
+        <w:t xml:space="preserve">图11 双侧迷走神经记录时的原始放电曲线</w:t>
+      </w:r>
+    </w:p>
+    <w:p>
+      <w:pPr>
+        <w:pStyle w:val="BodyText"/>
+      </w:pPr>
+      <w:r>
+        <w:t xml:space="preserve">相较切断前，簇状放电幅度明显增大，峰峰值1273</w:t>
+      </w:r>
+      <w:r>
+        <w:t xml:space="preserve"> </w:t>
+      </w:r>
+      <w:r>
+        <w:t xml:space="preserve">µV，放电簇间隔延长，呈现电活动增强而节律变慢的特点。</w:t>
+      </w:r>
+    </w:p>
+    <w:p>
+      <w:pPr>
+        <w:pStyle w:val="BodyText"/>
+      </w:pPr>
+      <w:r>
+        <w:drawing>
+          <wp:inline>
+            <wp:extent cx="4587875" cy="2360540"/>
+            <wp:effectExtent b="0" l="0" r="0" t="0"/>
+            <wp:docPr descr="" title="" id="66" name="Picture"/>
+            <a:graphic>
+              <a:graphicData uri="http://schemas.openxmlformats.org/drawingml/2006/picture">
+                <pic:pic>
+                  <pic:nvPicPr>
+                    <pic:cNvPr descr="figures/fig12.png" id="67" name="Picture"/>
+                    <pic:cNvPicPr>
+                      <a:picLocks noChangeArrowheads="1" noChangeAspect="1"/>
+                    </pic:cNvPicPr>
+                  </pic:nvPicPr>
+                  <pic:blipFill>
+                    <a:blip r:embed="rId65"/>
+                    <a:stretch>
+                      <a:fillRect/>
+                    </a:stretch>
+                  </pic:blipFill>
+                  <pic:spPr bwMode="auto">
+                    <a:xfrm>
+                      <a:off x="0" y="0"/>
+                      <a:ext cx="4587875" cy="2360540"/>
+                    </a:xfrm>
+                    <a:prstGeom prst="rect">
+                      <a:avLst/>
+                    </a:prstGeom>
+                    <a:noFill/>
+                    <a:ln w="9525">
+                      <a:noFill/>
+                      <a:headEnd/>
+                      <a:tailEnd/>
+                    </a:ln>
+                  </pic:spPr>
+                </pic:pic>
+              </a:graphicData>
+            </a:graphic>
+          </wp:inline>
+        </w:drawing>
+      </w:r>
+    </w:p>
+    <w:p>
+      <w:pPr>
+        <w:pStyle w:val="BodyText"/>
+      </w:pPr>
+      <w:r>
+        <w:t xml:space="preserve">图12 重复抽吸时的原始放电曲线</w:t>
+      </w:r>
+    </w:p>
+    <w:p>
+      <w:pPr>
+        <w:pStyle w:val="BodyText"/>
+      </w:pPr>
+      <w:r>
+        <w:t xml:space="preserve">可见较大的簇状活动，峰峰值1165</w:t>
+      </w:r>
+      <w:r>
+        <w:t xml:space="preserve"> </w:t>
+      </w:r>
+      <w:r>
+        <w:t xml:space="preserve">µV。该图与双侧迷走图的横轴时间先后不同，不能单凭资料排列顺序认定其发生于双侧切断之后。</w:t>
+      </w:r>
+    </w:p>
+    <w:bookmarkEnd w:id="68"/>
+    <w:bookmarkEnd w:id="69"/>
+    <w:bookmarkStart w:id="75" w:name="实验讨论"/>
     <w:p>
       <w:pPr>
         <w:pStyle w:val="Heading1"/>
@@ -789,7 +3024,25 @@
         <w:tab/>
       </w:r>
       <w:r>
-        <w:t xml:space="preserve">讨论</w:t>
+        <w:t xml:space="preserve">实验讨论</w:t>
+      </w:r>
+    </w:p>
+    <w:bookmarkStart w:id="70" w:name="吸入氮气与二氧化碳的影响"/>
+    <w:p>
+      <w:pPr>
+        <w:pStyle w:val="Heading2"/>
+      </w:pPr>
+      <w:r>
+        <w:rPr>
+          <w:rStyle w:val="SectionNumber"/>
+        </w:rPr>
+        <w:t xml:space="preserve">4.1</w:t>
+      </w:r>
+      <w:r>
+        <w:tab/>
+      </w:r>
+      <w:r>
+        <w:t xml:space="preserve">吸入氮气与二氧化碳的影响</w:t>
       </w:r>
     </w:p>
     <w:p>
@@ -797,11 +3050,196 @@
         <w:pStyle w:val="FirstParagraph"/>
       </w:pPr>
       <w:r>
-        <w:t xml:space="preserve">观察到 T 波高尖，与预期一致；数据来自单只动物（n=1），结论需谨慎。</w:t>
-      </w:r>
-    </w:p>
-    <w:bookmarkEnd w:id="26"/>
-    <w:bookmarkStart w:id="27" w:name="结论"/>
+        <w:t xml:space="preserve">教材指出，动脉血氧分压降低、二氧化碳分压升高及pH下降均可通过化学感受性反射影响呼吸活动[1]。吸入氮气主要通过降低吸入氧分压形成低氧刺激；吸入二氧化碳则增加二氧化碳负荷。二者改变呼吸驱动的途径不同，其效应还取决于气体浓度、作用时间和动物当时状态。</w:t>
+      </w:r>
+    </w:p>
+    <w:p>
+      <w:pPr>
+        <w:pStyle w:val="BodyText"/>
+      </w:pPr>
+      <w:r>
+        <w:t xml:space="preserve">本次氮气、二氧化碳时段的峰峰值分别为1630、1360 µV，均高于初始记录的605</w:t>
+      </w:r>
+      <w:r>
+        <w:t xml:space="preserve"> </w:t>
+      </w:r>
+      <w:r>
+        <w:t xml:space="preserve">µV，表现为放电幅度增大；但截图中的簇间隔并未较初始记录一致缩短。因此，结果支持气体条件变化伴随吸气相关电活动改变，尚不足以直接得出”两种气体均使呼吸加快”或比较两者刺激强弱的结论。较重低氧对中枢的抑制、刺激阶段不同以及基线不一致均是可能解释，不能由现有截图逐一证实。</w:t>
+      </w:r>
+    </w:p>
+    <w:bookmarkEnd w:id="70"/>
+    <w:bookmarkStart w:id="71" w:name="肺充气和抽气与肺牵张反射"/>
+    <w:p>
+      <w:pPr>
+        <w:pStyle w:val="Heading2"/>
+      </w:pPr>
+      <w:r>
+        <w:rPr>
+          <w:rStyle w:val="SectionNumber"/>
+        </w:rPr>
+        <w:t xml:space="preserve">4.2</w:t>
+      </w:r>
+      <w:r>
+        <w:tab/>
+      </w:r>
+      <w:r>
+        <w:t xml:space="preserve">肺充气和抽气与肺牵张反射</w:t>
+      </w:r>
+    </w:p>
+    <w:p>
+      <w:pPr>
+        <w:pStyle w:val="FirstParagraph"/>
+      </w:pPr>
+      <w:r>
+        <w:t xml:space="preserve">肺扩张可兴奋肺牵张感受器，其传入纤维经迷走神经进入中枢，促使吸气终止并向呼气转换；肺萎陷则可通过反射兴奋吸气[1]。因此，充气、抽气的方向和时机都会影响观察结果。</w:t>
+      </w:r>
+    </w:p>
+    <w:p>
+      <w:pPr>
+        <w:pStyle w:val="BodyText"/>
+      </w:pPr>
+      <w:r>
+        <w:t xml:space="preserve">打气时段幅度较小，与吸气活动受到抑制的预期方向相符；抽气时段则出现较大的放电范围。不过，原图没有连续标明刺激开始、维持与解除的全过程，不能确定反射潜伏期、暂停时长及完整恢复过程。抽气前段的尖峰还可能含有机械扰动，不能全部归为生理性增强。</w:t>
+      </w:r>
+    </w:p>
+    <w:bookmarkEnd w:id="71"/>
+    <w:bookmarkStart w:id="72" w:name="乳酸和尼可刹米的影响"/>
+    <w:p>
+      <w:pPr>
+        <w:pStyle w:val="Heading2"/>
+      </w:pPr>
+      <w:r>
+        <w:rPr>
+          <w:rStyle w:val="SectionNumber"/>
+        </w:rPr>
+        <w:t xml:space="preserve">4.3</w:t>
+      </w:r>
+      <w:r>
+        <w:tab/>
+      </w:r>
+      <w:r>
+        <w:t xml:space="preserve">乳酸和尼可刹米的影响</w:t>
+      </w:r>
+    </w:p>
+    <w:p>
+      <w:pPr>
+        <w:pStyle w:val="FirstParagraph"/>
+      </w:pPr>
+      <w:r>
+        <w:t xml:space="preserve">乳酸可使血液酸度增加，按教材原理可通过化学感受性反射促进呼吸；尼可刹米属于呼吸兴奋药，其影响应结合处理前后吸气活动判断[1]。本次乳酸与尼可刹米时段放电簇均较生理盐水时段密集，峰峰值分别为673、483</w:t>
+      </w:r>
+      <w:r>
+        <w:t xml:space="preserve"> </w:t>
+      </w:r>
+      <w:r>
+        <w:t xml:space="preserve">µV，较生理盐水时段的332 µV增大，与呼吸相关电活动增强的解释相容。</w:t>
+      </w:r>
+    </w:p>
+    <w:p>
+      <w:pPr>
+        <w:pStyle w:val="BodyText"/>
+      </w:pPr>
+      <w:r>
+        <w:t xml:space="preserve">不同药物时段的峰峰值并非等剂量、等时间的药效指标。缺少给药前后连续稳定基线和实际剂量记录时，不能据此认定乳酸的”效力”大于尼可刹米。现有曲线也不包含吗啡抑制与解救的完整配对过程，不能据此评价尼可刹米逆转吗啡抑制的效果。</w:t>
+      </w:r>
+    </w:p>
+    <w:bookmarkEnd w:id="72"/>
+    <w:bookmarkStart w:id="73" w:name="迷走神经在呼吸调节中的作用"/>
+    <w:p>
+      <w:pPr>
+        <w:pStyle w:val="Heading2"/>
+      </w:pPr>
+      <w:r>
+        <w:rPr>
+          <w:rStyle w:val="SectionNumber"/>
+        </w:rPr>
+        <w:t xml:space="preserve">4.4</w:t>
+      </w:r>
+      <w:r>
+        <w:tab/>
+      </w:r>
+      <w:r>
+        <w:t xml:space="preserve">迷走神经在呼吸调节中的作用</w:t>
+      </w:r>
+    </w:p>
+    <w:p>
+      <w:pPr>
+        <w:pStyle w:val="FirstParagraph"/>
+      </w:pPr>
+      <w:r>
+        <w:t xml:space="preserve">切断前、单侧切断及双侧迷走记录的峰峰值依次为378、588、1273</w:t>
+      </w:r>
+      <w:r>
+        <w:t xml:space="preserve"> </w:t>
+      </w:r>
+      <w:r>
+        <w:t xml:space="preserve">µV。双侧记录的放电簇幅度更大、簇间隔更长，与迷走神经肺牵张反射传入减少后吸气活动延长、呼吸节律变慢的预期方向一致[1]。单侧切断后对侧传入仍可能保留，故其变化不必与双侧切断完全相同。</w:t>
+      </w:r>
+    </w:p>
+    <w:p>
+      <w:pPr>
+        <w:pStyle w:val="BodyText"/>
+      </w:pPr>
+      <w:r>
+        <w:t xml:space="preserve">电信号幅度增大不能直接证明潮气量增加；</w:t>
+      </w:r>
+      <w:r>
+        <w:t xml:space="preserve">“</w:t>
+      </w:r>
+      <w:r>
+        <w:t xml:space="preserve">深慢呼吸</w:t>
+      </w:r>
+      <w:r>
+        <w:t xml:space="preserve">”</w:t>
+      </w:r>
+      <w:r>
+        <w:t xml:space="preserve">的生理解释仍需结合积分曲线、呼吸相时程或通气量记录。重复抽吸图的横轴约在150:49之后，双侧迷走图则约在151:01之后，资料中的排列与图示时间并不完全一致，故本次不把重复抽吸图作为双侧切断后肺牵张反射消失的确定证据。</w:t>
+      </w:r>
+    </w:p>
+    <w:bookmarkEnd w:id="73"/>
+    <w:bookmarkStart w:id="74" w:name="记录局限与实验改进"/>
+    <w:p>
+      <w:pPr>
+        <w:pStyle w:val="Heading2"/>
+      </w:pPr>
+      <w:r>
+        <w:rPr>
+          <w:rStyle w:val="SectionNumber"/>
+        </w:rPr>
+        <w:t xml:space="preserve">4.5</w:t>
+      </w:r>
+      <w:r>
+        <w:tab/>
+      </w:r>
+      <w:r>
+        <w:t xml:space="preserve">记录局限与实验改进</w:t>
+      </w:r>
+    </w:p>
+    <w:p>
+      <w:pPr>
+        <w:pStyle w:val="FirstParagraph"/>
+      </w:pPr>
+      <w:r>
+        <w:t xml:space="preserve">首先，初始图内可见”AIR IN 20</w:t>
+      </w:r>
+      <w:r>
+        <w:t xml:space="preserve"> </w:t>
+      </w:r>
+      <w:r>
+        <w:t xml:space="preserve">ml”标记，说明起始对照可能受机械操作影响；跨时段比较应优先采用每项处理前的稳定基线。其次，膈肌电幅度受电极固定、肌肉接触、放大增益、动物动作及基线噪声影响，需保持记录条件一致，并区分呼吸簇与操作伪差。</w:t>
+      </w:r>
+    </w:p>
+    <w:p>
+      <w:pPr>
+        <w:pStyle w:val="BodyText"/>
+      </w:pPr>
+      <w:r>
+        <w:t xml:space="preserve">再次，本次截图未同步展示完整积分曲线、血气与pH、实际给药量、气流速度及刺激持续时间，因而只能进行描述性分析。改进时应保存连续原始信号，标明每次给药、注气、抽气和神经切断的准确时刻；固定时间窗计数放电簇，并结合积分面积及呼吸相时程分析。动物数量和独立重复信息不足时，不作总体疗效或统计显著性的推断。</w:t>
+      </w:r>
+    </w:p>
+    <w:bookmarkEnd w:id="74"/>
+    <w:bookmarkEnd w:id="75"/>
+    <w:bookmarkStart w:id="76" w:name="实验结论"/>
     <w:p>
       <w:pPr>
         <w:pStyle w:val="Heading1"/>
@@ -816,7 +3254,7 @@
         <w:tab/>
       </w:r>
       <w:r>
-        <w:t xml:space="preserve">结论</w:t>
+        <w:t xml:space="preserve">实验结论</w:t>
       </w:r>
     </w:p>
     <w:p>
@@ -824,11 +3262,35 @@
         <w:pStyle w:val="FirstParagraph"/>
       </w:pPr>
       <w:r>
-        <w:t xml:space="preserve">静脉注射 KCl 可使家兔心电图出现高钾血症样改变。</w:t>
-      </w:r>
-    </w:p>
-    <w:bookmarkEnd w:id="27"/>
-    <w:bookmarkStart w:id="28" w:name="参考文献"/>
+        <w:t xml:space="preserve">（1）吸入氮气与二氧化碳时段均见放电幅度较初始记录增大，但节律变化需单独判断，本次不能简单归纳为均使呼吸加快。</w:t>
+      </w:r>
+    </w:p>
+    <w:p>
+      <w:pPr>
+        <w:pStyle w:val="BodyText"/>
+      </w:pPr>
+      <w:r>
+        <w:t xml:space="preserve">（2）肺充气和抽气时的曲线存在差异，与肺牵张反射调节吸气活动的原理相容；完整反射时程仍需连续记录验证。</w:t>
+      </w:r>
+    </w:p>
+    <w:p>
+      <w:pPr>
+        <w:pStyle w:val="BodyText"/>
+      </w:pPr>
+      <w:r>
+        <w:t xml:space="preserve">（3）乳酸、尼可刹米时段较生理盐水时段呈现更密集的放电簇和较大的峰峰值，提示呼吸相关电活动受到影响。</w:t>
+      </w:r>
+    </w:p>
+    <w:p>
+      <w:pPr>
+        <w:pStyle w:val="BodyText"/>
+      </w:pPr>
+      <w:r>
+        <w:t xml:space="preserve">（4）双侧迷走记录呈现较切断前更大的放电簇和更长的簇间隔，支持迷走神经参与呼吸节律调节；现有资料不足以确认重复抽吸发生在双侧切断之后。</w:t>
+      </w:r>
+    </w:p>
+    <w:bookmarkEnd w:id="76"/>
+    <w:bookmarkStart w:id="77" w:name="参考文献"/>
     <w:p>
       <w:pPr>
         <w:pStyle w:val="Heading1"/>
@@ -842,10 +3304,30 @@
         <w:pStyle w:val="FirstParagraph"/>
       </w:pPr>
       <w:r>
-        <w:t xml:space="preserve">[1] 严钰锋，马淑兰．功能学科实验教程[M]．2020．</w:t>
-      </w:r>
-    </w:p>
-    <w:bookmarkEnd w:id="28"/>
+        <w:t xml:space="preserve">[1]《功能学科实验教程》. 第三节 呼吸系统实验，实验3.1</w:t>
+      </w:r>
+      <w:r>
+        <w:t xml:space="preserve"> </w:t>
+      </w:r>
+      <w:r>
+        <w:t xml:space="preserve">呼吸调节及药物影响：124–127.</w:t>
+      </w:r>
+    </w:p>
+    <w:p>
+      <w:pPr>
+        <w:pStyle w:val="BodyText"/>
+      </w:pPr>
+      <w:r>
+        <w:t xml:space="preserve">[2]本组实验原始记录.</w:t>
+      </w:r>
+      <w:r>
+        <w:t xml:space="preserve"> </w:t>
+      </w:r>
+      <w:r>
+        <w:t xml:space="preserve">原始数据文件：初始、气体刺激、肺充气与抽气、药物及迷走神经处理共12幅记录图，2026年10月15日.</w:t>
+      </w:r>
+    </w:p>
+    <w:bookmarkEnd w:id="77"/>
     <w:sectPr>
       <w:headerReference r:id="rId9" w:type="default"/>
       <w:footerReference r:id="rId10" w:type="default"/>

</xml_diff>

<commit_message>
Overhaul: RAG + skill architecture, minimal cover, stats/plot/style/cite tools, paper-style README and dsh guide
- Add BM25 retrieval (rag.py), stylecheck, refcheck (Crossref), labstats, labplot
- Add per-experiment textbook-wording notes and a verified 14-paper literature registry
- Rewrite skills into an 11-skill pipeline; add architecture diagram
- Single minimal rabbit/mouse cover, header, roman/arabic page numbering (Word + LaTeX)
- New README (zh/en), GUIDE, DESIGN, FORMAT, THIRD_PARTY, CITATION.cff

Co-Authored-By: Claude Sonnet 5.5 <noreply@anthropic.com>
Claude-Session: https://claude.ai/code/session_01RhAjm4oyFT9JNX7xvcF7Ks
</commit_message>
<xml_diff>
--- a/examples/sample-report/report.docx
+++ b/examples/sample-report/report.docx
@@ -4,13 +4,80 @@
   <w:body>
     <w:p>
       <w:pPr>
+        <w:spacing w:before="0" w:after="80"/>
+        <w:ind w:firstLine="0" w:left="0" w:right="0"/>
+        <w:jc w:val="center"/>
+      </w:pPr>
+      <w:r>
+        <w:rPr>
+          <w:rFonts w:ascii="Times New Roman" w:hAnsi="Times New Roman" w:cs="Times New Roman" w:eastAsia="黑体"/>
+          <w:b w:val="0"/>
+          <w:color w:val="59606A"/>
+          <w:sz w:val="28"/>
+          <w:spacing w:val="60"/>
+        </w:rPr>
+        <w:t>复旦大学上海医学院</w:t>
+      </w:r>
+    </w:p>
+    <w:p>
+      <w:pPr>
+        <w:spacing w:before="0" w:after="800"/>
+        <w:ind w:firstLine="0" w:left="0" w:right="0"/>
+        <w:jc w:val="center"/>
+      </w:pPr>
+      <w:r>
+        <w:rPr>
+          <w:rFonts w:ascii="Times New Roman" w:hAnsi="Times New Roman" w:cs="Times New Roman" w:eastAsia="黑体"/>
+          <w:b w:val="0"/>
+          <w:color w:val="000000"/>
+          <w:sz w:val="32"/>
+          <w:spacing w:val="40"/>
+        </w:rPr>
+        <w:t>功能学科综合实验</w:t>
+      </w:r>
+    </w:p>
+    <w:p>
+      <w:pPr>
+        <w:spacing w:before="0" w:after="120" w:line="288" w:lineRule="auto"/>
+        <w:ind w:firstLine="0" w:left="0" w:right="0"/>
+        <w:jc w:val="center"/>
+      </w:pPr>
+      <w:r>
+        <w:rPr>
+          <w:rFonts w:ascii="Arial" w:hAnsi="Arial" w:cs="Arial" w:eastAsia="黑体"/>
+          <w:b/>
+          <w:color w:val="000000"/>
+          <w:sz w:val="52"/>
+        </w:rPr>
+        <w:t>家兔高钾血症（示例·勿抄）</w:t>
+      </w:r>
+    </w:p>
+    <w:p>
+      <w:pPr>
         <w:spacing w:before="0" w:after="0"/>
-        <w:ind w:left="0" w:right="0" w:firstLine="0"/>
+        <w:ind w:firstLine="0" w:left="0" w:right="0"/>
+        <w:jc w:val="center"/>
+      </w:pPr>
+      <w:r>
+        <w:rPr>
+          <w:rFonts w:ascii="Times New Roman" w:hAnsi="Times New Roman" w:cs="Times New Roman" w:eastAsia="宋体"/>
+          <w:b w:val="0"/>
+          <w:color w:val="59606A"/>
+          <w:sz w:val="24"/>
+        </w:rPr>
+        <w:t>实验 2.7</w:t>
+      </w:r>
+    </w:p>
+    <w:p>
+      <w:pPr>
+        <w:spacing w:before="800" w:after="800"/>
+        <w:ind w:firstLine="0" w:left="0" w:right="0"/>
+        <w:jc w:val="center"/>
       </w:pPr>
       <w:r>
         <w:drawing>
           <wp:inline>
-            <wp:extent cx="7560000" cy="3780000"/>
+            <wp:extent cx="2520000" cy="1697684"/>
             <wp:docPr id="1" name="Picture 1"/>
             <wp:cNvGraphicFramePr>
               <a:graphicFrameLocks noChangeAspect="1"/>
@@ -19,7 +86,7 @@
               <a:graphicData uri="http://schemas.openxmlformats.org/drawingml/2006/picture">
                 <pic:pic>
                   <pic:nvPicPr>
-                    <pic:cNvPr id="0" name="cover_cardio.jpg"/>
+                    <pic:cNvPr id="0" name="rabbit.png"/>
                     <pic:cNvPicPr/>
                   </pic:nvPicPr>
                   <pic:blipFill>
@@ -31,7 +98,7 @@
                   <pic:spPr>
                     <a:xfrm>
                       <a:off x="0" y="0"/>
-                      <a:ext cx="7560000" cy="3780000"/>
+                      <a:ext cx="2520000" cy="1697684"/>
                     </a:xfrm>
                     <a:prstGeom prst="rect"/>
                   </pic:spPr>
@@ -44,459 +111,159 @@
     </w:p>
     <w:p>
       <w:pPr>
-        <w:spacing w:before="280" w:after="200"/>
-        <w:ind w:left="1361" w:right="1361" w:firstLine="0"/>
-      </w:pPr>
-      <w:r>
-        <w:rPr>
-          <w:rFonts w:ascii="Times New Roman" w:hAnsi="Times New Roman" w:cs="Times New Roman" w:eastAsia="黑体"/>
-          <w:b/>
-          <w:color w:val="1B3FB0"/>
-          <w:sz w:val="26"/>
-          <w:spacing w:val="40"/>
-        </w:rPr>
-        <w:t>复旦大学</w:t>
-      </w:r>
+        <w:spacing w:before="0" w:after="160"/>
+        <w:ind w:firstLine="0" w:left="0" w:right="0"/>
+        <w:jc w:val="center"/>
+      </w:pPr>
       <w:r>
         <w:rPr>
           <w:rFonts w:ascii="Times New Roman" w:hAnsi="Times New Roman" w:cs="Times New Roman" w:eastAsia="黑体"/>
           <w:b w:val="0"/>
-          <w:color w:val="59607A"/>
+          <w:color w:val="59606A"/>
           <w:sz w:val="26"/>
         </w:rPr>
-        <w:t xml:space="preserve">　｜　</w:t>
-      </w:r>
+        <w:t xml:space="preserve">班　级　</w:t>
+      </w:r>
+      <w:r>
+        <w:rPr>
+          <w:rFonts w:ascii="Times New Roman" w:hAnsi="Times New Roman" w:cs="Times New Roman" w:eastAsia="宋体"/>
+          <w:b w:val="0"/>
+          <w:color w:val="000000"/>
+          <w:sz w:val="28"/>
+        </w:rPr>
+        <w:t>示例班级</w:t>
+      </w:r>
+    </w:p>
+    <w:p>
+      <w:pPr>
+        <w:spacing w:before="0" w:after="160"/>
+        <w:ind w:firstLine="0" w:left="0" w:right="0"/>
+        <w:jc w:val="center"/>
+      </w:pPr>
       <w:r>
         <w:rPr>
           <w:rFonts w:ascii="Times New Roman" w:hAnsi="Times New Roman" w:cs="Times New Roman" w:eastAsia="黑体"/>
           <w:b w:val="0"/>
-          <w:color w:val="081650"/>
+          <w:color w:val="59606A"/>
           <w:sz w:val="26"/>
-          <w:spacing w:val="40"/>
         </w:rPr>
-        <w:t>功能学科综合实验</w:t>
-      </w:r>
-    </w:p>
-    <w:p>
-      <w:pPr>
-        <w:spacing w:before="280" w:after="80" w:line="276" w:lineRule="auto"/>
-        <w:ind w:left="1361" w:right="1361" w:firstLine="0"/>
-      </w:pPr>
-      <w:r>
-        <w:rPr>
-          <w:rFonts w:ascii="Arial" w:hAnsi="Arial" w:cs="Arial" w:eastAsia="黑体"/>
-          <w:b/>
-          <w:color w:val="081650"/>
-          <w:sz w:val="56"/>
-        </w:rPr>
-        <w:t>家兔高钾血症实验报告（示例·勿抄）</w:t>
-      </w:r>
-    </w:p>
-    <w:p>
-      <w:pPr>
-        <w:spacing w:before="0" w:after="40"/>
-        <w:ind w:left="1361" w:right="1361" w:firstLine="0"/>
-      </w:pPr>
-      <w:r>
-        <w:rPr>
-          <w:rFonts w:ascii="Arial" w:hAnsi="Arial" w:cs="Arial" w:eastAsia="黑体"/>
-          <w:b/>
-          <w:color w:val="149C8E"/>
-          <w:sz w:val="22"/>
-          <w:spacing w:val="60"/>
-        </w:rPr>
-        <w:t>LABORATORY REPORT</w:t>
-      </w:r>
-    </w:p>
-    <w:p>
-      <w:pPr>
-        <w:spacing w:before="0" w:after="360"/>
-        <w:ind w:left="1361" w:right="7937" w:firstLine="0"/>
-        <w:pBdr>
-          <w:bottom w:val="single" w:sz="18" w:space="1" w:color="149C8E"/>
-        </w:pBdr>
-      </w:pPr>
+        <w:t xml:space="preserve">姓　名　</w:t>
+      </w:r>
       <w:r>
         <w:rPr>
           <w:rFonts w:ascii="Times New Roman" w:hAnsi="Times New Roman" w:cs="Times New Roman" w:eastAsia="宋体"/>
           <w:b w:val="0"/>
-          <w:sz w:val="4"/>
+          <w:color w:val="000000"/>
+          <w:sz w:val="28"/>
         </w:rPr>
-      </w:r>
-    </w:p>
-    <w:tbl>
-      <w:tblPr>
-        <w:tblW w:type="auto" w:w="0"/>
-        <w:tblLook w:firstColumn="1" w:firstRow="1" w:lastColumn="0" w:lastRow="0" w:noHBand="0" w:noVBand="1" w:val="04A0"/>
-        <w:tblInd w:w="1360" w:type="dxa"/>
-        <w:tblLayout w:type="fixed"/>
-      </w:tblPr>
-      <w:tblGrid>
-        <w:gridCol w:w="1814"/>
-        <w:gridCol w:w="5556"/>
-      </w:tblGrid>
-      <w:tr>
-        <w:tc>
-          <w:tcPr>
-            <w:tcW w:type="dxa" w:w="1814"/>
-            <w:tcBorders>
-              <w:bottom w:val="single" w:sz="4" w:space="0" w:color="D5DBEE"/>
-            </w:tcBorders>
-          </w:tcPr>
-          <w:p>
-            <w:pPr>
-              <w:spacing w:before="100" w:after="100"/>
-            </w:pPr>
-            <w:r>
-              <w:rPr>
-                <w:rFonts w:ascii="Times New Roman" w:hAnsi="Times New Roman" w:cs="Times New Roman" w:eastAsia="黑体"/>
-                <w:b w:val="0"/>
-                <w:color w:val="59607A"/>
-                <w:sz w:val="22"/>
-              </w:rPr>
-              <w:t>实验编号</w:t>
-            </w:r>
-          </w:p>
-        </w:tc>
-        <w:tc>
-          <w:tcPr>
-            <w:tcW w:type="dxa" w:w="5556"/>
-            <w:tcBorders>
-              <w:bottom w:val="single" w:sz="4" w:space="0" w:color="D5DBEE"/>
-            </w:tcBorders>
-          </w:tcPr>
-          <w:p>
-            <w:pPr>
-              <w:spacing w:before="100" w:after="100"/>
-            </w:pPr>
-            <w:r>
-              <w:rPr>
-                <w:rFonts w:ascii="Times New Roman" w:hAnsi="Times New Roman" w:cs="Times New Roman" w:eastAsia="宋体"/>
-                <w:b/>
-                <w:color w:val="081650"/>
-                <w:sz w:val="26"/>
-              </w:rPr>
-              <w:t>2.7</w:t>
-            </w:r>
-          </w:p>
-        </w:tc>
-      </w:tr>
-      <w:tr>
-        <w:tc>
-          <w:tcPr>
-            <w:tcW w:type="dxa" w:w="1814"/>
-            <w:tcBorders>
-              <w:bottom w:val="single" w:sz="4" w:space="0" w:color="D5DBEE"/>
-            </w:tcBorders>
-          </w:tcPr>
-          <w:p>
-            <w:pPr>
-              <w:spacing w:before="100" w:after="100"/>
-            </w:pPr>
-            <w:r>
-              <w:rPr>
-                <w:rFonts w:ascii="Times New Roman" w:hAnsi="Times New Roman" w:cs="Times New Roman" w:eastAsia="黑体"/>
-                <w:b w:val="0"/>
-                <w:color w:val="59607A"/>
-                <w:sz w:val="22"/>
-              </w:rPr>
-              <w:t>班　　级</w:t>
-            </w:r>
-          </w:p>
-        </w:tc>
-        <w:tc>
-          <w:tcPr>
-            <w:tcW w:type="dxa" w:w="5556"/>
-            <w:tcBorders>
-              <w:bottom w:val="single" w:sz="4" w:space="0" w:color="D5DBEE"/>
-            </w:tcBorders>
-          </w:tcPr>
-          <w:p>
-            <w:pPr>
-              <w:spacing w:before="100" w:after="100"/>
-            </w:pPr>
-            <w:r>
-              <w:rPr>
-                <w:rFonts w:ascii="Times New Roman" w:hAnsi="Times New Roman" w:cs="Times New Roman" w:eastAsia="宋体"/>
-                <w:b/>
-                <w:color w:val="081650"/>
-                <w:sz w:val="26"/>
-              </w:rPr>
-              <w:t>示例班级</w:t>
-            </w:r>
-          </w:p>
-        </w:tc>
-      </w:tr>
-      <w:tr>
-        <w:tc>
-          <w:tcPr>
-            <w:tcW w:type="dxa" w:w="1814"/>
-            <w:tcBorders>
-              <w:bottom w:val="single" w:sz="4" w:space="0" w:color="D5DBEE"/>
-            </w:tcBorders>
-          </w:tcPr>
-          <w:p>
-            <w:pPr>
-              <w:spacing w:before="100" w:after="100"/>
-            </w:pPr>
-            <w:r>
-              <w:rPr>
-                <w:rFonts w:ascii="Times New Roman" w:hAnsi="Times New Roman" w:cs="Times New Roman" w:eastAsia="黑体"/>
-                <w:b w:val="0"/>
-                <w:color w:val="59607A"/>
-                <w:sz w:val="22"/>
-              </w:rPr>
-              <w:t>姓　　名</w:t>
-            </w:r>
-          </w:p>
-        </w:tc>
-        <w:tc>
-          <w:tcPr>
-            <w:tcW w:type="dxa" w:w="5556"/>
-            <w:tcBorders>
-              <w:bottom w:val="single" w:sz="4" w:space="0" w:color="D5DBEE"/>
-            </w:tcBorders>
-          </w:tcPr>
-          <w:p>
-            <w:pPr>
-              <w:spacing w:before="100" w:after="100"/>
-            </w:pPr>
-            <w:r>
-              <w:rPr>
-                <w:rFonts w:ascii="Times New Roman" w:hAnsi="Times New Roman" w:cs="Times New Roman" w:eastAsia="宋体"/>
-                <w:b/>
-                <w:color w:val="081650"/>
-                <w:sz w:val="26"/>
-              </w:rPr>
-              <w:t>示例同学</w:t>
-            </w:r>
-          </w:p>
-        </w:tc>
-      </w:tr>
-      <w:tr>
-        <w:tc>
-          <w:tcPr>
-            <w:tcW w:type="dxa" w:w="1814"/>
-            <w:tcBorders>
-              <w:bottom w:val="single" w:sz="4" w:space="0" w:color="D5DBEE"/>
-            </w:tcBorders>
-          </w:tcPr>
-          <w:p>
-            <w:pPr>
-              <w:spacing w:before="100" w:after="100"/>
-            </w:pPr>
-            <w:r>
-              <w:rPr>
-                <w:rFonts w:ascii="Times New Roman" w:hAnsi="Times New Roman" w:cs="Times New Roman" w:eastAsia="黑体"/>
-                <w:b w:val="0"/>
-                <w:color w:val="59607A"/>
-                <w:sz w:val="22"/>
-              </w:rPr>
-              <w:t>学　　号</w:t>
-            </w:r>
-          </w:p>
-        </w:tc>
-        <w:tc>
-          <w:tcPr>
-            <w:tcW w:type="dxa" w:w="5556"/>
-            <w:tcBorders>
-              <w:bottom w:val="single" w:sz="4" w:space="0" w:color="D5DBEE"/>
-            </w:tcBorders>
-          </w:tcPr>
-          <w:p>
-            <w:pPr>
-              <w:spacing w:before="100" w:after="100"/>
-            </w:pPr>
-            <w:r>
-              <w:rPr>
-                <w:rFonts w:ascii="Times New Roman" w:hAnsi="Times New Roman" w:cs="Times New Roman" w:eastAsia="宋体"/>
-                <w:b/>
-                <w:color w:val="081650"/>
-                <w:sz w:val="26"/>
-              </w:rPr>
-              <w:t>00000000000</w:t>
-            </w:r>
-          </w:p>
-        </w:tc>
-      </w:tr>
-      <w:tr>
-        <w:tc>
-          <w:tcPr>
-            <w:tcW w:type="dxa" w:w="1814"/>
-            <w:tcBorders>
-              <w:bottom w:val="single" w:sz="4" w:space="0" w:color="D5DBEE"/>
-            </w:tcBorders>
-          </w:tcPr>
-          <w:p>
-            <w:pPr>
-              <w:spacing w:before="100" w:after="100"/>
-            </w:pPr>
-            <w:r>
-              <w:rPr>
-                <w:rFonts w:ascii="Times New Roman" w:hAnsi="Times New Roman" w:cs="Times New Roman" w:eastAsia="黑体"/>
-                <w:b w:val="0"/>
-                <w:color w:val="59607A"/>
-                <w:sz w:val="22"/>
-              </w:rPr>
-              <w:t>实验小组</w:t>
-            </w:r>
-          </w:p>
-        </w:tc>
-        <w:tc>
-          <w:tcPr>
-            <w:tcW w:type="dxa" w:w="5556"/>
-            <w:tcBorders>
-              <w:bottom w:val="single" w:sz="4" w:space="0" w:color="D5DBEE"/>
-            </w:tcBorders>
-          </w:tcPr>
-          <w:p>
-            <w:pPr>
-              <w:spacing w:before="100" w:after="100"/>
-            </w:pPr>
-            <w:r>
-              <w:rPr>
-                <w:rFonts w:ascii="Times New Roman" w:hAnsi="Times New Roman" w:cs="Times New Roman" w:eastAsia="宋体"/>
-                <w:b/>
-                <w:color w:val="081650"/>
-                <w:sz w:val="26"/>
-              </w:rPr>
-              <w:t>第 0 组</w:t>
-            </w:r>
-          </w:p>
-        </w:tc>
-      </w:tr>
-      <w:tr>
-        <w:tc>
-          <w:tcPr>
-            <w:tcW w:type="dxa" w:w="1814"/>
-            <w:tcBorders>
-              <w:bottom w:val="single" w:sz="4" w:space="0" w:color="D5DBEE"/>
-            </w:tcBorders>
-          </w:tcPr>
-          <w:p>
-            <w:pPr>
-              <w:spacing w:before="100" w:after="100"/>
-            </w:pPr>
-            <w:r>
-              <w:rPr>
-                <w:rFonts w:ascii="Times New Roman" w:hAnsi="Times New Roman" w:cs="Times New Roman" w:eastAsia="黑体"/>
-                <w:b w:val="0"/>
-                <w:color w:val="59607A"/>
-                <w:sz w:val="22"/>
-              </w:rPr>
-              <w:t>实验日期</w:t>
-            </w:r>
-          </w:p>
-        </w:tc>
-        <w:tc>
-          <w:tcPr>
-            <w:tcW w:type="dxa" w:w="5556"/>
-            <w:tcBorders>
-              <w:bottom w:val="single" w:sz="4" w:space="0" w:color="D5DBEE"/>
-            </w:tcBorders>
-          </w:tcPr>
-          <w:p>
-            <w:pPr>
-              <w:spacing w:before="100" w:after="100"/>
-            </w:pPr>
-            <w:r>
-              <w:rPr>
-                <w:rFonts w:ascii="Times New Roman" w:hAnsi="Times New Roman" w:cs="Times New Roman" w:eastAsia="宋体"/>
-                <w:b/>
-                <w:color w:val="081650"/>
-                <w:sz w:val="26"/>
-              </w:rPr>
-              <w:t>2025.01.01</w:t>
-            </w:r>
-          </w:p>
-        </w:tc>
-      </w:tr>
-      <w:tr>
-        <w:tc>
-          <w:tcPr>
-            <w:tcW w:type="dxa" w:w="1814"/>
-            <w:tcBorders>
-              <w:bottom w:val="single" w:sz="4" w:space="0" w:color="D5DBEE"/>
-            </w:tcBorders>
-          </w:tcPr>
-          <w:p>
-            <w:pPr>
-              <w:spacing w:before="100" w:after="100"/>
-            </w:pPr>
-            <w:r>
-              <w:rPr>
-                <w:rFonts w:ascii="Times New Roman" w:hAnsi="Times New Roman" w:cs="Times New Roman" w:eastAsia="黑体"/>
-                <w:b w:val="0"/>
-                <w:color w:val="59607A"/>
-                <w:sz w:val="22"/>
-              </w:rPr>
-              <w:t>指导老师</w:t>
-            </w:r>
-          </w:p>
-        </w:tc>
-        <w:tc>
-          <w:tcPr>
-            <w:tcW w:type="dxa" w:w="5556"/>
-            <w:tcBorders>
-              <w:bottom w:val="single" w:sz="4" w:space="0" w:color="D5DBEE"/>
-            </w:tcBorders>
-          </w:tcPr>
-          <w:p>
-            <w:pPr>
-              <w:spacing w:before="100" w:after="100"/>
-            </w:pPr>
-            <w:r>
-              <w:rPr>
-                <w:rFonts w:ascii="Times New Roman" w:hAnsi="Times New Roman" w:cs="Times New Roman" w:eastAsia="宋体"/>
-                <w:b/>
-                <w:color w:val="081650"/>
-                <w:sz w:val="26"/>
-              </w:rPr>
-              <w:t>示例老师</w:t>
-            </w:r>
-          </w:p>
-        </w:tc>
-      </w:tr>
-    </w:tbl>
-    <w:p>
-      <w:pPr>
-        <w:spacing w:before="680" w:after="0"/>
-        <w:ind w:left="1361" w:right="1361" w:firstLine="0"/>
+        <w:t>示例同学</w:t>
+      </w:r>
+    </w:p>
+    <w:p>
+      <w:pPr>
+        <w:spacing w:before="0" w:after="160"/>
+        <w:ind w:firstLine="0" w:left="0" w:right="0"/>
+        <w:jc w:val="center"/>
       </w:pPr>
       <w:r>
         <w:rPr>
-          <w:rFonts w:ascii="Arial" w:hAnsi="Arial" w:cs="Arial" w:eastAsia="宋体"/>
+          <w:rFonts w:ascii="Times New Roman" w:hAnsi="Times New Roman" w:cs="Times New Roman" w:eastAsia="黑体"/>
           <w:b w:val="0"/>
-          <w:color w:val="59607A"/>
-          <w:sz w:val="18"/>
-          <w:spacing w:val="20"/>
+          <w:color w:val="59606A"/>
+          <w:sz w:val="26"/>
         </w:rPr>
-        <w:t>Fudan University · Integrated Functional Experiments</w:t>
+        <w:t xml:space="preserve">学　号　</w:t>
+      </w:r>
+      <w:r>
+        <w:rPr>
+          <w:rFonts w:ascii="Times New Roman" w:hAnsi="Times New Roman" w:cs="Times New Roman" w:eastAsia="宋体"/>
+          <w:b w:val="0"/>
+          <w:color w:val="000000"/>
+          <w:sz w:val="28"/>
+        </w:rPr>
+        <w:t>00000000000</w:t>
+      </w:r>
+    </w:p>
+    <w:p>
+      <w:pPr>
+        <w:spacing w:before="0" w:after="160"/>
+        <w:ind w:firstLine="0" w:left="0" w:right="0"/>
+        <w:jc w:val="center"/>
+      </w:pPr>
+      <w:r>
+        <w:rPr>
+          <w:rFonts w:ascii="Times New Roman" w:hAnsi="Times New Roman" w:cs="Times New Roman" w:eastAsia="黑体"/>
+          <w:b w:val="0"/>
+          <w:color w:val="59606A"/>
+          <w:sz w:val="26"/>
+        </w:rPr>
+        <w:t xml:space="preserve">日　期　</w:t>
+      </w:r>
+      <w:r>
+        <w:rPr>
+          <w:rFonts w:ascii="Times New Roman" w:hAnsi="Times New Roman" w:cs="Times New Roman" w:eastAsia="宋体"/>
+          <w:b w:val="0"/>
+          <w:color w:val="000000"/>
+          <w:sz w:val="28"/>
+        </w:rPr>
+        <w:t>2026.01.01</w:t>
       </w:r>
     </w:p>
     <w:p>
       <w:pPr>
         <w:spacing w:after="0"/>
         <w:sectPr>
-          <w:pgSz w:w="11906" w:h="16838"/>
-          <w:pgMar w:top="0" w:right="0" w:bottom="0" w:left="0" w:header="0" w:footer="0" w:gutter="0"/>
+          <w:pgSz w:h="16838" w:w="11906"/>
+          <w:pgMar w:bottom="1440" w:footer="737" w:header="737" w:left="1701" w:right="1701" w:top="1440"/>
+          <w:vAlign w:val="center"/>
         </w:sectPr>
       </w:pPr>
     </w:p>
-    <w:p>
-      <w:pPr>
-        <w:pStyle w:val="ReportTitle"/>
-      </w:pPr>
-      <w:r>
-        <w:t xml:space="preserve">家兔高钾血症实验报告（示例·勿抄）</w:t>
-      </w:r>
-    </w:p>
-    <w:p>
-      <w:pPr>
-        <w:pStyle w:val="ReportMeta"/>
-      </w:pPr>
-      <w:r>
-        <w:t xml:space="preserve">示例班级　示例同学　00000000000　实验日期：2025.01.01　指导老师：示例老师</w:t>
+    <w:sdt>
+      <w:sdtPr>
+        <w:docPartObj>
+          <w:docPartGallery w:val="Table of Contents"/>
+          <w:docPartUnique/>
+        </w:docPartObj>
+      </w:sdtPr>
+      <w:sdtContent>
+        <w:p>
+          <w:pPr>
+            <w:pStyle w:val="TOCHeading"/>
+          </w:pPr>
+          <w:r>
+            <w:t xml:space="preserve">目 录</w:t>
+          </w:r>
+        </w:p>
+        <w:p>
+          <w:r>
+            <w:fldChar w:fldCharType="begin" w:dirty="true"/>
+            <w:instrText xml:space="preserve">TOC \o "1-2" \h \z \u</w:instrText>
+            <w:fldChar w:fldCharType="separate"/>
+            <w:fldChar w:fldCharType="end"/>
+          </w:r>
+        </w:p>
+      </w:sdtContent>
+    </w:sdt>
+    <w:p>
+      <w:pPr>
+        <w:spacing w:after="0"/>
+        <w:sectPr>
+          <w:headerReference r:id="rId9" w:type="default"/>
+          <w:footerReference r:id="rId10" w:type="default"/>
+          <w:pgSz w:h="16838" w:w="11906"/>
+          <w:pgMar w:bottom="1440" w:footer="737" w:header="737" w:left="1701" w:right="1701" w:top="1440"/>
+          <w:pgNumType w:fmt="upperRoman" w:start="1"/>
+        </w:sectPr>
+      </w:pPr>
+    </w:p>
+    <w:bookmarkStart w:id="20" w:name="摘要"/>
+    <w:p>
+      <w:pPr>
+        <w:pStyle w:val="Heading1"/>
+      </w:pPr>
+      <w:r>
+        <w:t xml:space="preserve">摘要</w:t>
       </w:r>
     </w:p>
     <w:p>
@@ -517,43 +284,166 @@
         <w:t xml:space="preserve">，数据由作者编造，仅用于演示排版与写作结构，请勿抄袭或当作真实结果。</w:t>
       </w:r>
     </w:p>
-    <w:bookmarkStart w:id="20" w:name="一实验目的"/>
-    <w:p>
-      <w:pPr>
-        <w:pStyle w:val="Heading1"/>
-      </w:pPr>
-      <w:r>
-        <w:t xml:space="preserve">一、实验目的</w:t>
-      </w:r>
-    </w:p>
     <w:p>
       <w:pPr>
         <w:pStyle w:val="FirstParagraph"/>
       </w:pPr>
       <w:r>
-        <w:t xml:space="preserve">观察高钾血症对家兔心电图的影响，理解血钾升高致心脏兴奋性与传导性改变的机制。</w:t>
-      </w:r>
-    </w:p>
-    <w:bookmarkEnd w:id="20"/>
-    <w:bookmarkStart w:id="21" w:name="二实验结果"/>
-    <w:p>
-      <w:pPr>
-        <w:pStyle w:val="Heading1"/>
-      </w:pPr>
-      <w:r>
-        <w:t xml:space="preserve">二、实验结果</w:t>
-      </w:r>
-    </w:p>
-    <w:p>
-      <w:pPr>
-        <w:pStyle w:val="FirstParagraph"/>
+        <w:t xml:space="preserve">观察静脉注射氯化钾对家兔心电图的影响，探讨血钾升高导致心脏兴奋性与传导性改变的机制。（示例）</w:t>
+      </w:r>
+    </w:p>
+    <w:p>
+      <w:pPr>
+        <w:pStyle w:val="BodyText"/>
       </w:pPr>
       <w:r>
         <w:rPr>
           <w:bCs/>
           <w:b/>
         </w:rPr>
-        <w:t xml:space="preserve">表 1　静脉注射 KCl 前后心电图指标（虚构数据）</w:t>
+        <w:t xml:space="preserve">关键词：</w:t>
+      </w:r>
+      <w:r>
+        <w:t xml:space="preserve">高钾血症；心电图；静息电位</w:t>
+      </w:r>
+    </w:p>
+    <w:bookmarkEnd w:id="20"/>
+    <w:bookmarkStart w:id="21" w:name="引言"/>
+    <w:p>
+      <w:pPr>
+        <w:pStyle w:val="Heading1"/>
+      </w:pPr>
+      <w:r>
+        <w:rPr>
+          <w:rStyle w:val="SectionNumber"/>
+        </w:rPr>
+        <w:t xml:space="preserve">1</w:t>
+      </w:r>
+      <w:r>
+        <w:tab/>
+      </w:r>
+      <w:r>
+        <w:t xml:space="preserve">引言</w:t>
+      </w:r>
+    </w:p>
+    <w:p>
+      <w:pPr>
+        <w:pStyle w:val="FirstParagraph"/>
+      </w:pPr>
+      <w:r>
+        <w:t xml:space="preserve">高钾血症时细胞外 K⁺ 浓度升高，细胞内外 K⁺ 浓度差减小，静息电位负值减小，心肌兴奋性先升高后降低。</w:t>
+      </w:r>
+    </w:p>
+    <w:bookmarkEnd w:id="21"/>
+    <w:bookmarkStart w:id="24" w:name="材料与方法"/>
+    <w:p>
+      <w:pPr>
+        <w:pStyle w:val="Heading1"/>
+      </w:pPr>
+      <w:r>
+        <w:rPr>
+          <w:rStyle w:val="SectionNumber"/>
+        </w:rPr>
+        <w:t xml:space="preserve">2</w:t>
+      </w:r>
+      <w:r>
+        <w:tab/>
+      </w:r>
+      <w:r>
+        <w:t xml:space="preserve">材料与方法</w:t>
+      </w:r>
+    </w:p>
+    <w:bookmarkStart w:id="22" w:name="实验对象与药品"/>
+    <w:p>
+      <w:pPr>
+        <w:pStyle w:val="Heading2"/>
+      </w:pPr>
+      <w:r>
+        <w:rPr>
+          <w:rStyle w:val="SectionNumber"/>
+        </w:rPr>
+        <w:t xml:space="preserve">2.1</w:t>
+      </w:r>
+      <w:r>
+        <w:tab/>
+      </w:r>
+      <w:r>
+        <w:t xml:space="preserve">实验对象与药品</w:t>
+      </w:r>
+    </w:p>
+    <w:p>
+      <w:pPr>
+        <w:pStyle w:val="FirstParagraph"/>
+      </w:pPr>
+      <w:r>
+        <w:t xml:space="preserve">家兔 1 只，体重 2.50 kg；10% KCl 溶液。</w:t>
+      </w:r>
+    </w:p>
+    <w:bookmarkEnd w:id="22"/>
+    <w:bookmarkStart w:id="23" w:name="实验步骤"/>
+    <w:p>
+      <w:pPr>
+        <w:pStyle w:val="Heading2"/>
+      </w:pPr>
+      <w:r>
+        <w:rPr>
+          <w:rStyle w:val="SectionNumber"/>
+        </w:rPr>
+        <w:t xml:space="preserve">2.2</w:t>
+      </w:r>
+      <w:r>
+        <w:tab/>
+      </w:r>
+      <w:r>
+        <w:t xml:space="preserve">实验步骤</w:t>
+      </w:r>
+    </w:p>
+    <w:p>
+      <w:pPr>
+        <w:pStyle w:val="FirstParagraph"/>
+      </w:pPr>
+      <w:r>
+        <w:t xml:space="preserve">麻醉后描记正常心电图，经耳缘静脉缓慢注射 KCl，观察 T 波与 P-R 间期变化。</w:t>
+      </w:r>
+    </w:p>
+    <w:bookmarkEnd w:id="23"/>
+    <w:bookmarkEnd w:id="24"/>
+    <w:bookmarkStart w:id="25" w:name="结果"/>
+    <w:p>
+      <w:pPr>
+        <w:pStyle w:val="Heading1"/>
+      </w:pPr>
+      <w:r>
+        <w:rPr>
+          <w:rStyle w:val="SectionNumber"/>
+        </w:rPr>
+        <w:t xml:space="preserve">3</w:t>
+      </w:r>
+      <w:r>
+        <w:tab/>
+      </w:r>
+      <w:r>
+        <w:t xml:space="preserve">结果</w:t>
+      </w:r>
+    </w:p>
+    <w:p>
+      <w:pPr>
+        <w:pStyle w:val="FirstParagraph"/>
+      </w:pPr>
+      <w:r>
+        <w:t xml:space="preserve">注射后 T 波高尖，P-R 间期延长（表 1，虚构数据）。</w:t>
+      </w:r>
+    </w:p>
+    <w:p>
+      <w:pPr>
+        <w:pStyle w:val="BodyText"/>
+      </w:pPr>
+      <w:r>
+        <w:rPr>
+          <w:bCs/>
+          <w:b/>
+        </w:rPr>
+        <w:t xml:space="preserve">表 1　静脉注射 KCl 前后心电图指标</w:t>
       </w:r>
     </w:p>
     <w:tbl>
@@ -563,9 +453,8 @@
         <w:tblLook w:firstRow="1" w:lastRow="0" w:firstColumn="0" w:lastColumn="0" w:noHBand="0" w:noVBand="0" w:val="0020"/>
         <w:jc w:val="center"/>
         <w:tblBorders>
-          <w:top w:val="single" w:sz="12" w:space="0" w:color="081650"/>
-          <w:bottom w:val="single" w:sz="12" w:space="0" w:color="081650"/>
-          <w:insideH w:val="single" w:sz="2" w:space="0" w:color="D5DBEE"/>
+          <w:top w:val="single" w:sz="12" w:space="0" w:color="000000"/>
+          <w:bottom w:val="single" w:sz="12" w:space="0" w:color="000000"/>
         </w:tblBorders>
         <w:tblCellMar>
           <w:top w:w="40" w:type="dxa"/>
@@ -586,22 +475,21 @@
         </w:trPr>
         <w:tc>
           <w:tcPr>
-            <w:shd w:val="clear" w:color="auto" w:fill="EAF0FF"/>
             <w:tcBorders>
-              <w:bottom w:val="single" w:sz="8" w:space="0" w:color="081650"/>
+              <w:bottom w:val="single" w:sz="6" w:space="0" w:color="000000"/>
             </w:tcBorders>
           </w:tcPr>
           <w:p>
             <w:pPr>
               <w:pStyle w:val="Compact"/>
-              <w:spacing w:before="20" w:after="20"/>
+              <w:spacing w:before="20" w:after="20" w:line="288" w:lineRule="auto"/>
               <w:ind w:firstLine="0"/>
               <w:jc w:val="center"/>
             </w:pPr>
             <w:r>
               <w:rPr>
                 <w:b/>
-                <w:sz w:val="19"/>
+                <w:sz w:val="21"/>
               </w:rPr>
               <w:t xml:space="preserve">时间点</w:t>
             </w:r>
@@ -609,22 +497,21 @@
         </w:tc>
         <w:tc>
           <w:tcPr>
-            <w:shd w:val="clear" w:color="auto" w:fill="EAF0FF"/>
             <w:tcBorders>
-              <w:bottom w:val="single" w:sz="8" w:space="0" w:color="081650"/>
+              <w:bottom w:val="single" w:sz="6" w:space="0" w:color="000000"/>
             </w:tcBorders>
           </w:tcPr>
           <w:p>
             <w:pPr>
               <w:pStyle w:val="Compact"/>
-              <w:spacing w:before="20" w:after="20"/>
+              <w:spacing w:before="20" w:after="20" w:line="288" w:lineRule="auto"/>
               <w:ind w:firstLine="0"/>
               <w:jc w:val="center"/>
             </w:pPr>
             <w:r>
               <w:rPr>
                 <w:b/>
-                <w:sz w:val="19"/>
+                <w:sz w:val="21"/>
               </w:rPr>
               <w:t xml:space="preserve">心率（次/分）</w:t>
             </w:r>
@@ -632,22 +519,21 @@
         </w:tc>
         <w:tc>
           <w:tcPr>
-            <w:shd w:val="clear" w:color="auto" w:fill="EAF0FF"/>
             <w:tcBorders>
-              <w:bottom w:val="single" w:sz="8" w:space="0" w:color="081650"/>
+              <w:bottom w:val="single" w:sz="6" w:space="0" w:color="000000"/>
             </w:tcBorders>
           </w:tcPr>
           <w:p>
             <w:pPr>
               <w:pStyle w:val="Compact"/>
-              <w:spacing w:before="20" w:after="20"/>
+              <w:spacing w:before="20" w:after="20" w:line="288" w:lineRule="auto"/>
               <w:ind w:firstLine="0"/>
               <w:jc w:val="center"/>
             </w:pPr>
             <w:r>
               <w:rPr>
                 <w:b/>
-                <w:sz w:val="19"/>
+                <w:sz w:val="21"/>
               </w:rPr>
               <w:t xml:space="preserve">P-R 间期（ms）</w:t>
             </w:r>
@@ -655,22 +541,21 @@
         </w:tc>
         <w:tc>
           <w:tcPr>
-            <w:shd w:val="clear" w:color="auto" w:fill="EAF0FF"/>
             <w:tcBorders>
-              <w:bottom w:val="single" w:sz="8" w:space="0" w:color="081650"/>
+              <w:bottom w:val="single" w:sz="6" w:space="0" w:color="000000"/>
             </w:tcBorders>
           </w:tcPr>
           <w:p>
             <w:pPr>
               <w:pStyle w:val="Compact"/>
-              <w:spacing w:before="20" w:after="20"/>
+              <w:spacing w:before="20" w:after="20" w:line="288" w:lineRule="auto"/>
               <w:ind w:firstLine="0"/>
               <w:jc w:val="center"/>
             </w:pPr>
             <w:r>
               <w:rPr>
                 <w:b/>
-                <w:sz w:val="19"/>
+                <w:sz w:val="21"/>
               </w:rPr>
               <w:t xml:space="preserve">T 波高度（mV）</w:t>
             </w:r>
@@ -683,13 +568,13 @@
           <w:p>
             <w:pPr>
               <w:pStyle w:val="Compact"/>
-              <w:spacing w:before="20" w:after="20"/>
+              <w:spacing w:before="20" w:after="20" w:line="288" w:lineRule="auto"/>
               <w:ind w:firstLine="0"/>
               <w:jc w:val="center"/>
             </w:pPr>
             <w:r>
               <w:rPr>
-                <w:sz w:val="19"/>
+                <w:sz w:val="21"/>
               </w:rPr>
               <w:t xml:space="preserve">对照</w:t>
             </w:r>
@@ -700,13 +585,13 @@
           <w:p>
             <w:pPr>
               <w:pStyle w:val="Compact"/>
-              <w:spacing w:before="20" w:after="20"/>
+              <w:spacing w:before="20" w:after="20" w:line="288" w:lineRule="auto"/>
               <w:ind w:firstLine="0"/>
               <w:jc w:val="center"/>
             </w:pPr>
             <w:r>
               <w:rPr>
-                <w:sz w:val="19"/>
+                <w:sz w:val="21"/>
               </w:rPr>
               <w:t xml:space="preserve">210</w:t>
             </w:r>
@@ -717,13 +602,13 @@
           <w:p>
             <w:pPr>
               <w:pStyle w:val="Compact"/>
-              <w:spacing w:before="20" w:after="20"/>
+              <w:spacing w:before="20" w:after="20" w:line="288" w:lineRule="auto"/>
               <w:ind w:firstLine="0"/>
               <w:jc w:val="center"/>
             </w:pPr>
             <w:r>
               <w:rPr>
-                <w:sz w:val="19"/>
+                <w:sz w:val="21"/>
               </w:rPr>
               <w:t xml:space="preserve">60</w:t>
             </w:r>
@@ -734,13 +619,13 @@
           <w:p>
             <w:pPr>
               <w:pStyle w:val="Compact"/>
-              <w:spacing w:before="20" w:after="20"/>
+              <w:spacing w:before="20" w:after="20" w:line="288" w:lineRule="auto"/>
               <w:ind w:firstLine="0"/>
               <w:jc w:val="center"/>
             </w:pPr>
             <w:r>
               <w:rPr>
-                <w:sz w:val="19"/>
+                <w:sz w:val="21"/>
               </w:rPr>
               <w:t xml:space="preserve">0.15</w:t>
             </w:r>
@@ -753,13 +638,13 @@
           <w:p>
             <w:pPr>
               <w:pStyle w:val="Compact"/>
-              <w:spacing w:before="20" w:after="20"/>
+              <w:spacing w:before="20" w:after="20" w:line="288" w:lineRule="auto"/>
               <w:ind w:firstLine="0"/>
               <w:jc w:val="center"/>
             </w:pPr>
             <w:r>
               <w:rPr>
-                <w:sz w:val="19"/>
+                <w:sz w:val="21"/>
               </w:rPr>
               <w:t xml:space="preserve">注射后 2 min</w:t>
             </w:r>
@@ -770,13 +655,13 @@
           <w:p>
             <w:pPr>
               <w:pStyle w:val="Compact"/>
-              <w:spacing w:before="20" w:after="20"/>
+              <w:spacing w:before="20" w:after="20" w:line="288" w:lineRule="auto"/>
               <w:ind w:firstLine="0"/>
               <w:jc w:val="center"/>
             </w:pPr>
             <w:r>
               <w:rPr>
-                <w:sz w:val="19"/>
+                <w:sz w:val="21"/>
               </w:rPr>
               <w:t xml:space="preserve">180</w:t>
             </w:r>
@@ -787,13 +672,13 @@
           <w:p>
             <w:pPr>
               <w:pStyle w:val="Compact"/>
-              <w:spacing w:before="20" w:after="20"/>
+              <w:spacing w:before="20" w:after="20" w:line="288" w:lineRule="auto"/>
               <w:ind w:firstLine="0"/>
               <w:jc w:val="center"/>
             </w:pPr>
             <w:r>
               <w:rPr>
-                <w:sz w:val="19"/>
+                <w:sz w:val="21"/>
               </w:rPr>
               <w:t xml:space="preserve">75</w:t>
             </w:r>
@@ -804,13 +689,13 @@
           <w:p>
             <w:pPr>
               <w:pStyle w:val="Compact"/>
-              <w:spacing w:before="20" w:after="20"/>
+              <w:spacing w:before="20" w:after="20" w:line="288" w:lineRule="auto"/>
               <w:ind w:firstLine="0"/>
               <w:jc w:val="center"/>
             </w:pPr>
             <w:r>
               <w:rPr>
-                <w:sz w:val="19"/>
+                <w:sz w:val="21"/>
               </w:rPr>
               <w:t xml:space="preserve">0.35</w:t>
             </w:r>
@@ -823,13 +708,13 @@
           <w:p>
             <w:pPr>
               <w:pStyle w:val="Compact"/>
-              <w:spacing w:before="20" w:after="20"/>
+              <w:spacing w:before="20" w:after="20" w:line="288" w:lineRule="auto"/>
               <w:ind w:firstLine="0"/>
               <w:jc w:val="center"/>
             </w:pPr>
             <w:r>
               <w:rPr>
-                <w:sz w:val="19"/>
+                <w:sz w:val="21"/>
               </w:rPr>
               <w:t xml:space="preserve">注射后 4 min</w:t>
             </w:r>
@@ -840,13 +725,13 @@
           <w:p>
             <w:pPr>
               <w:pStyle w:val="Compact"/>
-              <w:spacing w:before="20" w:after="20"/>
+              <w:spacing w:before="20" w:after="20" w:line="288" w:lineRule="auto"/>
               <w:ind w:firstLine="0"/>
               <w:jc w:val="center"/>
             </w:pPr>
             <w:r>
               <w:rPr>
-                <w:sz w:val="19"/>
+                <w:sz w:val="21"/>
               </w:rPr>
               <w:t xml:space="preserve">120</w:t>
             </w:r>
@@ -857,13 +742,13 @@
           <w:p>
             <w:pPr>
               <w:pStyle w:val="Compact"/>
-              <w:spacing w:before="20" w:after="20"/>
+              <w:spacing w:before="20" w:after="20" w:line="288" w:lineRule="auto"/>
               <w:ind w:firstLine="0"/>
               <w:jc w:val="center"/>
             </w:pPr>
             <w:r>
               <w:rPr>
-                <w:sz w:val="19"/>
+                <w:sz w:val="21"/>
               </w:rPr>
               <w:t xml:space="preserve">110</w:t>
             </w:r>
@@ -874,13 +759,13 @@
           <w:p>
             <w:pPr>
               <w:pStyle w:val="Compact"/>
-              <w:spacing w:before="20" w:after="20"/>
+              <w:spacing w:before="20" w:after="20" w:line="288" w:lineRule="auto"/>
               <w:ind w:firstLine="0"/>
               <w:jc w:val="center"/>
             </w:pPr>
             <w:r>
               <w:rPr>
-                <w:sz w:val="19"/>
+                <w:sz w:val="21"/>
               </w:rPr>
               <w:t xml:space="preserve">0.30</w:t>
             </w:r>
@@ -888,54 +773,84 @@
         </w:tc>
       </w:tr>
     </w:tbl>
-    <w:p>
-      <w:pPr>
-        <w:pStyle w:val="BodyText"/>
-      </w:pPr>
-      <w:r>
-        <w:t xml:space="preserve">血清 K⁺ 升高，细胞内外 K⁺ 浓度差减小，静息电位负值减小；H₂O 摄入不变。</w:t>
-      </w:r>
-    </w:p>
-    <w:bookmarkEnd w:id="21"/>
-    <w:bookmarkStart w:id="22" w:name="三讨论"/>
+    <w:bookmarkEnd w:id="25"/>
+    <w:bookmarkStart w:id="26" w:name="讨论"/>
     <w:p>
       <w:pPr>
         <w:pStyle w:val="Heading1"/>
       </w:pPr>
       <w:r>
-        <w:t xml:space="preserve">三、讨论</w:t>
-      </w:r>
-    </w:p>
-    <w:p>
-      <w:pPr>
-        <w:numPr>
-          <w:ilvl w:val="0"/>
-          <w:numId w:val="1001"/>
-        </w:numPr>
-        <w:pStyle w:val="Compact"/>
-      </w:pPr>
-      <w:r>
-        <w:t xml:space="preserve">观察到 T 波高尖，与预期一致；</w:t>
-      </w:r>
-    </w:p>
-    <w:p>
-      <w:pPr>
-        <w:numPr>
-          <w:ilvl w:val="0"/>
-          <w:numId w:val="1001"/>
-        </w:numPr>
-        <w:pStyle w:val="Compact"/>
-      </w:pPr>
-      <w:r>
-        <w:t xml:space="preserve">数据来自单只动物（n=1），结论需谨慎。</w:t>
-      </w:r>
-    </w:p>
-    <w:bookmarkEnd w:id="22"/>
+        <w:rPr>
+          <w:rStyle w:val="SectionNumber"/>
+        </w:rPr>
+        <w:t xml:space="preserve">4</w:t>
+      </w:r>
+      <w:r>
+        <w:tab/>
+      </w:r>
+      <w:r>
+        <w:t xml:space="preserve">讨论</w:t>
+      </w:r>
+    </w:p>
+    <w:p>
+      <w:pPr>
+        <w:pStyle w:val="FirstParagraph"/>
+      </w:pPr>
+      <w:r>
+        <w:t xml:space="preserve">观察到 T 波高尖，与预期一致；数据来自单只动物（n=1），结论需谨慎。</w:t>
+      </w:r>
+    </w:p>
+    <w:bookmarkEnd w:id="26"/>
+    <w:bookmarkStart w:id="27" w:name="结论"/>
+    <w:p>
+      <w:pPr>
+        <w:pStyle w:val="Heading1"/>
+      </w:pPr>
+      <w:r>
+        <w:rPr>
+          <w:rStyle w:val="SectionNumber"/>
+        </w:rPr>
+        <w:t xml:space="preserve">5</w:t>
+      </w:r>
+      <w:r>
+        <w:tab/>
+      </w:r>
+      <w:r>
+        <w:t xml:space="preserve">结论</w:t>
+      </w:r>
+    </w:p>
+    <w:p>
+      <w:pPr>
+        <w:pStyle w:val="FirstParagraph"/>
+      </w:pPr>
+      <w:r>
+        <w:t xml:space="preserve">静脉注射 KCl 可使家兔心电图出现高钾血症样改变。</w:t>
+      </w:r>
+    </w:p>
+    <w:bookmarkEnd w:id="27"/>
+    <w:bookmarkStart w:id="28" w:name="参考文献"/>
+    <w:p>
+      <w:pPr>
+        <w:pStyle w:val="Heading1"/>
+      </w:pPr>
+      <w:r>
+        <w:t xml:space="preserve">参考文献</w:t>
+      </w:r>
+    </w:p>
+    <w:p>
+      <w:pPr>
+        <w:pStyle w:val="FirstParagraph"/>
+      </w:pPr>
+      <w:r>
+        <w:t xml:space="preserve">[1] 严钰锋，马淑兰．功能学科实验教程[M]．2020．</w:t>
+      </w:r>
+    </w:p>
+    <w:bookmarkEnd w:id="28"/>
     <w:sectPr>
       <w:headerReference r:id="rId9" w:type="default"/>
       <w:footerReference r:id="rId10" w:type="default"/>
       <w:pgSz w:h="16838" w:w="11906"/>
-      <w:pgMar w:bottom="1247" w:footer="624" w:header="680" w:left="1417" w:right="1417" w:top="1361"/>
+      <w:pgMar w:bottom="1440" w:footer="737" w:header="737" w:left="1701" w:right="1701" w:top="1440"/>
       <w:pgNumType w:start="1"/>
     </w:sectPr>
   </w:body>
@@ -956,26 +871,12 @@
     <w:r/>
     <w:r>
       <w:rPr>
-        <w:color w:val="59607A"/>
-        <w:sz w:val="18"/>
-      </w:rPr>
-      <w:t xml:space="preserve">— </w:t>
-    </w:r>
-    <w:r>
-      <w:rPr>
-        <w:color w:val="59607A"/>
-        <w:sz w:val="18"/>
+        <w:color w:val="000000"/>
+        <w:sz w:val="21"/>
       </w:rPr>
       <w:fldChar w:fldCharType="begin"/>
       <w:instrText xml:space="preserve">PAGE</w:instrText>
       <w:fldChar w:fldCharType="end"/>
-    </w:r>
-    <w:r>
-      <w:rPr>
-        <w:color w:val="59607A"/>
-        <w:sz w:val="18"/>
-      </w:rPr>
-      <w:t xml:space="preserve"> —</w:t>
     </w:r>
   </w:p>
 </w:ftr>
@@ -1005,19 +906,76 @@
   <w:p>
     <w:pPr>
       <w:pStyle w:val="Header"/>
-      <w:jc w:val="right"/>
+      <w:tabs>
+        <w:tab w:pos="8504" w:val="right"/>
+      </w:tabs>
+      <w:ind w:firstLine="0"/>
+      <w:jc w:val="left"/>
       <w:pBdr>
-        <w:bottom w:val="single" w:sz="6" w:space="4" w:color="149C8E"/>
+        <w:bottom w:val="single" w:sz="6" w:space="4" w:color="5F7568"/>
       </w:pBdr>
     </w:pPr>
+    <w:r>
+      <w:drawing>
+        <wp:inline xmlns:a="http://schemas.openxmlformats.org/drawingml/2006/main" xmlns:pic="http://schemas.openxmlformats.org/drawingml/2006/picture">
+          <wp:extent cx="268854" cy="180000"/>
+          <wp:docPr id="1" name="Picture 1"/>
+          <wp:cNvGraphicFramePr>
+            <a:graphicFrameLocks noChangeAspect="1"/>
+          </wp:cNvGraphicFramePr>
+          <a:graphic>
+            <a:graphicData uri="http://schemas.openxmlformats.org/drawingml/2006/picture">
+              <pic:pic>
+                <pic:nvPicPr>
+                  <pic:cNvPr id="0" name="rabbit_icon.png"/>
+                  <pic:cNvPicPr/>
+                </pic:nvPicPr>
+                <pic:blipFill>
+                  <a:blip r:embed="rId1"/>
+                  <a:stretch>
+                    <a:fillRect/>
+                  </a:stretch>
+                </pic:blipFill>
+                <pic:spPr>
+                  <a:xfrm>
+                    <a:off x="0" y="0"/>
+                    <a:ext cx="268854" cy="180000"/>
+                  </a:xfrm>
+                  <a:prstGeom prst="rect"/>
+                </pic:spPr>
+              </pic:pic>
+            </a:graphicData>
+          </a:graphic>
+        </wp:inline>
+      </w:drawing>
+    </w:r>
+    <w:r>
+      <w:t xml:space="preserve"> </w:t>
+    </w:r>
     <w:r/>
     <w:r>
       <w:rPr>
-        <w:rFonts w:ascii="Times New Roman" w:hAnsi="Times New Roman" w:cs="Times New Roman" w:eastAsia="楷体"/>
-        <w:color w:val="59607A"/>
+        <w:rFonts w:ascii="Times New Roman" w:hAnsi="Times New Roman" w:cs="Times New Roman" w:eastAsia="宋体"/>
+        <w:color w:val="59606A"/>
         <w:sz w:val="18"/>
       </w:rPr>
-      <w:t>功能学科综合实验　00000000000　示例同学</w:t>
+      <w:t>功能学科综合实验实验报告</w:t>
+    </w:r>
+    <w:r>
+      <w:rPr>
+        <w:rFonts w:ascii="Times New Roman" w:hAnsi="Times New Roman" w:cs="Times New Roman" w:eastAsia="宋体"/>
+        <w:color w:val="59606A"/>
+        <w:sz w:val="18"/>
+      </w:rPr>
+      <w:tab/>
+    </w:r>
+    <w:r>
+      <w:rPr>
+        <w:rFonts w:ascii="Times New Roman" w:hAnsi="Times New Roman" w:cs="Times New Roman" w:eastAsia="宋体"/>
+        <w:color w:val="59606A"/>
+        <w:sz w:val="18"/>
+      </w:rPr>
+      <w:t>00000000000</w:t>
     </w:r>
   </w:p>
 </w:hdr>
@@ -1101,123 +1059,8 @@
       </w:pPr>
     </w:lvl>
   </w:abstractNum>
-  <w:abstractNum w:abstractNumId="99411">
-    <w:nsid w:val="A99411"/>
-    <w:multiLevelType w:val="multilevel"/>
-    <w:lvl w:ilvl="0">
-      <w:start w:val="1"/>
-      <w:numFmt w:val="decimal"/>
-      <w:lvlText w:val="%1."/>
-      <w:lvlJc w:val="left"/>
-      <w:pPr>
-        <w:ind w:left="720" w:hanging="480"/>
-      </w:pPr>
-    </w:lvl>
-    <w:lvl w:ilvl="1">
-      <w:start w:val="1"/>
-      <w:numFmt w:val="decimal"/>
-      <w:lvlText w:val="%2."/>
-      <w:lvlJc w:val="left"/>
-      <w:pPr>
-        <w:ind w:left="1440" w:hanging="480"/>
-      </w:pPr>
-    </w:lvl>
-    <w:lvl w:ilvl="2">
-      <w:start w:val="1"/>
-      <w:numFmt w:val="decimal"/>
-      <w:lvlText w:val="%3."/>
-      <w:lvlJc w:val="left"/>
-      <w:pPr>
-        <w:ind w:left="2160" w:hanging="480"/>
-      </w:pPr>
-    </w:lvl>
-    <w:lvl w:ilvl="3">
-      <w:start w:val="1"/>
-      <w:numFmt w:val="decimal"/>
-      <w:lvlText w:val="%4."/>
-      <w:lvlJc w:val="left"/>
-      <w:pPr>
-        <w:ind w:left="2880" w:hanging="480"/>
-      </w:pPr>
-    </w:lvl>
-    <w:lvl w:ilvl="4">
-      <w:start w:val="1"/>
-      <w:numFmt w:val="decimal"/>
-      <w:lvlText w:val="%5."/>
-      <w:lvlJc w:val="left"/>
-      <w:pPr>
-        <w:ind w:left="3600" w:hanging="480"/>
-      </w:pPr>
-    </w:lvl>
-    <w:lvl w:ilvl="5">
-      <w:start w:val="1"/>
-      <w:numFmt w:val="decimal"/>
-      <w:lvlText w:val="%6."/>
-      <w:lvlJc w:val="left"/>
-      <w:pPr>
-        <w:ind w:left="4320" w:hanging="480"/>
-      </w:pPr>
-    </w:lvl>
-    <w:lvl w:ilvl="6">
-      <w:start w:val="1"/>
-      <w:numFmt w:val="decimal"/>
-      <w:lvlText w:val="%7."/>
-      <w:lvlJc w:val="left"/>
-      <w:pPr>
-        <w:ind w:left="5040" w:hanging="480"/>
-      </w:pPr>
-    </w:lvl>
-    <w:lvl w:ilvl="7">
-      <w:start w:val="1"/>
-      <w:numFmt w:val="decimal"/>
-      <w:lvlText w:val="%8."/>
-      <w:lvlJc w:val="left"/>
-      <w:pPr>
-        <w:ind w:left="5760" w:hanging="480"/>
-      </w:pPr>
-    </w:lvl>
-    <w:lvl w:ilvl="8">
-      <w:start w:val="1"/>
-      <w:numFmt w:val="decimal"/>
-      <w:lvlText w:val="%9."/>
-      <w:lvlJc w:val="left"/>
-      <w:pPr>
-        <w:ind w:left="6480" w:hanging="480"/>
-      </w:pPr>
-    </w:lvl>
-  </w:abstractNum>
   <w:num w:numId="1000">
     <w:abstractNumId w:val="990"/>
-  </w:num>
-  <w:num w:numId="1001">
-    <w:abstractNumId w:val="99411"/>
-    <w:lvlOverride w:ilvl="0">
-      <w:startOverride w:val="1"/>
-    </w:lvlOverride>
-    <w:lvlOverride w:ilvl="1">
-      <w:startOverride w:val="1"/>
-    </w:lvlOverride>
-    <w:lvlOverride w:ilvl="2">
-      <w:startOverride w:val="1"/>
-    </w:lvlOverride>
-    <w:lvlOverride w:ilvl="3">
-      <w:startOverride w:val="1"/>
-    </w:lvlOverride>
-    <w:lvlOverride w:ilvl="4">
-      <w:startOverride w:val="1"/>
-    </w:lvlOverride>
-    <w:lvlOverride w:ilvl="5">
-      <w:startOverride w:val="1"/>
-    </w:lvlOverride>
-    <w:lvlOverride w:ilvl="6">
-      <w:startOverride w:val="1"/>
-    </w:lvlOverride>
-    <w:lvlOverride w:ilvl="7">
-      <w:startOverride w:val="1"/>
-    </w:lvlOverride>
-    <w:lvlOverride w:ilvl="8">
-      <w:startOverride w:val="1"/>
-    </w:lvlOverride>
   </w:num>
 </w:numbering>
 </file>
@@ -1245,13 +1088,13 @@
     <w:qFormat/>
     <w:pPr>
       <w:keepNext w:val="0"/>
-      <w:spacing w:after="0" w:before="0" w:line="324" w:lineRule="auto"/>
+      <w:spacing w:after="0" w:before="0" w:line="360" w:lineRule="auto"/>
     </w:pPr>
     <w:rPr>
       <w:rFonts w:ascii="Times New Roman" w:cs="Times New Roman" w:eastAsia="宋体" w:hAnsi="Times New Roman"/>
       <w:b w:val="0"/>
       <w:i w:val="0"/>
-      <w:sz w:val="21"/>
+      <w:sz w:val="24"/>
     </w:rPr>
   </w:style>
   <w:style w:styleId="BodyText" w:type="paragraph">
@@ -1260,15 +1103,15 @@
     <w:link w:val="BodyTextChar"/>
     <w:pPr>
       <w:keepNext w:val="0"/>
-      <w:spacing w:after="60" w:before="0" w:line="336" w:lineRule="auto"/>
-      <w:ind w:firstLine="420"/>
+      <w:spacing w:after="0" w:before="0" w:line="360" w:lineRule="auto"/>
+      <w:ind w:firstLine="480"/>
     </w:pPr>
     <w:qFormat/>
     <w:rPr>
       <w:rFonts w:ascii="Times New Roman" w:cs="Times New Roman" w:eastAsia="宋体" w:hAnsi="Times New Roman"/>
       <w:b w:val="0"/>
       <w:i w:val="0"/>
-      <w:sz w:val="21"/>
+      <w:sz w:val="24"/>
     </w:rPr>
   </w:style>
   <w:style w:customStyle="1" w:styleId="FirstParagraph" w:type="paragraph">
@@ -1278,14 +1121,14 @@
     <w:qFormat/>
     <w:pPr>
       <w:keepNext w:val="0"/>
-      <w:spacing w:after="60" w:before="0" w:line="336" w:lineRule="auto"/>
-      <w:ind w:firstLine="420"/>
+      <w:spacing w:after="0" w:before="0" w:line="360" w:lineRule="auto"/>
+      <w:ind w:firstLine="480"/>
     </w:pPr>
     <w:rPr>
       <w:rFonts w:ascii="Times New Roman" w:cs="Times New Roman" w:eastAsia="宋体" w:hAnsi="Times New Roman"/>
       <w:b w:val="0"/>
       <w:i w:val="0"/>
-      <w:sz w:val="21"/>
+      <w:sz w:val="24"/>
     </w:rPr>
   </w:style>
   <w:style w:customStyle="1" w:styleId="Compact" w:type="paragraph">
@@ -1294,14 +1137,14 @@
     <w:qFormat/>
     <w:pPr>
       <w:keepNext w:val="0"/>
-      <w:spacing w:after="0" w:before="0" w:line="312" w:lineRule="auto"/>
+      <w:spacing w:after="0" w:before="0" w:line="336" w:lineRule="auto"/>
       <w:ind w:firstLine="0"/>
     </w:pPr>
     <w:rPr>
       <w:rFonts w:ascii="Times New Roman" w:cs="Times New Roman" w:eastAsia="宋体" w:hAnsi="Times New Roman"/>
       <w:b w:val="0"/>
       <w:i w:val="0"/>
-      <w:sz w:val="21"/>
+      <w:sz w:val="24"/>
     </w:rPr>
   </w:style>
   <w:style w:styleId="Title" w:type="paragraph">
@@ -1312,7 +1155,7 @@
     <w:pPr>
       <w:keepNext w:val="0"/>
       <w:keepLines/>
-      <w:spacing w:after="80" w:before="0" w:line="312" w:lineRule="auto"/>
+      <w:spacing w:after="120" w:before="0" w:line="312" w:lineRule="auto"/>
       <w:jc w:val="center"/>
     </w:pPr>
     <w:rPr>
@@ -1320,8 +1163,8 @@
       <w:b/>
       <w:bCs/>
       <w:i w:val="0"/>
-      <w:color w:val="081650"/>
-      <w:sz w:val="40"/>
+      <w:color w:val="000000"/>
+      <w:sz w:val="44"/>
       <w:szCs w:val="36"/>
     </w:rPr>
   </w:style>
@@ -1340,8 +1183,8 @@
       <w:rFonts w:ascii="Times New Roman" w:cs="Times New Roman" w:eastAsia="楷体" w:hAnsi="Times New Roman"/>
       <w:b w:val="0"/>
       <w:i w:val="0"/>
-      <w:color w:val="59607A"/>
-      <w:sz w:val="24"/>
+      <w:color w:val="59606A"/>
+      <w:sz w:val="28"/>
       <w:szCs w:val="30"/>
     </w:rPr>
   </w:style>
@@ -1356,11 +1199,11 @@
       <w:jc w:val="center"/>
     </w:pPr>
     <w:rPr>
-      <w:rFonts w:ascii="Times New Roman" w:cs="Times New Roman" w:eastAsia="楷体" w:hAnsi="Times New Roman"/>
+      <w:rFonts w:ascii="Times New Roman" w:cs="Times New Roman" w:eastAsia="宋体" w:hAnsi="Times New Roman"/>
       <w:b w:val="0"/>
       <w:i w:val="0"/>
-      <w:color w:val="59607A"/>
-      <w:sz w:val="21"/>
+      <w:color w:val="000000"/>
+      <w:sz w:val="24"/>
     </w:rPr>
   </w:style>
   <w:style w:styleId="Date" w:type="paragraph">
@@ -1374,11 +1217,11 @@
       <w:jc w:val="center"/>
     </w:pPr>
     <w:rPr>
-      <w:rFonts w:ascii="Times New Roman" w:cs="Times New Roman" w:eastAsia="楷体" w:hAnsi="Times New Roman"/>
+      <w:rFonts w:ascii="Times New Roman" w:cs="Times New Roman" w:eastAsia="宋体" w:hAnsi="Times New Roman"/>
       <w:b w:val="0"/>
       <w:i w:val="0"/>
-      <w:color w:val="59607A"/>
-      <w:sz w:val="21"/>
+      <w:color w:val="000000"/>
+      <w:sz w:val="24"/>
     </w:rPr>
   </w:style>
   <w:style w:customStyle="1" w:styleId="AbstractTitle" w:type="paragraph">
@@ -1408,33 +1251,33 @@
     <w:pPr>
       <w:keepNext w:val="0"/>
       <w:keepLines/>
-      <w:spacing w:after="0" w:before="0" w:line="312" w:lineRule="auto"/>
-      <w:jc w:val="center"/>
-    </w:pPr>
-    <w:rPr>
-      <w:rFonts w:ascii="Times New Roman" w:cs="Times New Roman" w:eastAsia="楷体" w:hAnsi="Times New Roman"/>
-      <w:b w:val="0"/>
-      <w:i w:val="0"/>
-      <w:color w:val="59607A"/>
-      <w:sz w:val="21"/>
-      <w:szCs w:val="20"/>
-    </w:rPr>
-  </w:style>
-  <w:style w:styleId="Bibliography" w:type="paragraph">
-    <w:name w:val="Bibliography"/>
-    <w:basedOn w:val="Normal"/>
-    <w:next w:val="Bibliography"/>
-    <w:qFormat/>
-    <w:pPr>
-      <w:keepNext w:val="0"/>
-      <w:spacing w:after="40" w:before="0" w:line="300" w:lineRule="auto"/>
-      <w:ind w:firstLine="0"/>
+      <w:spacing w:after="0" w:before="0" w:line="360" w:lineRule="auto"/>
+      <w:ind w:firstLine="480"/>
     </w:pPr>
     <w:rPr>
       <w:rFonts w:ascii="Times New Roman" w:cs="Times New Roman" w:eastAsia="宋体" w:hAnsi="Times New Roman"/>
       <w:b w:val="0"/>
       <w:i w:val="0"/>
-      <w:sz w:val="19"/>
+      <w:color w:val="000000"/>
+      <w:sz w:val="24"/>
+      <w:szCs w:val="20"/>
+    </w:rPr>
+  </w:style>
+  <w:style w:styleId="Bibliography" w:type="paragraph">
+    <w:name w:val="Bibliography"/>
+    <w:basedOn w:val="Normal"/>
+    <w:next w:val="Bibliography"/>
+    <w:qFormat/>
+    <w:pPr>
+      <w:keepNext w:val="0"/>
+      <w:spacing w:after="40" w:before="0" w:line="312" w:lineRule="auto"/>
+      <w:ind w:hanging="420" w:left="420"/>
+    </w:pPr>
+    <w:rPr>
+      <w:rFonts w:ascii="Times New Roman" w:cs="Times New Roman" w:eastAsia="宋体" w:hAnsi="Times New Roman"/>
+      <w:b w:val="0"/>
+      <w:i w:val="0"/>
+      <w:sz w:val="21"/>
     </w:rPr>
   </w:style>
   <w:style w:styleId="Heading1" w:type="paragraph">
@@ -1637,16 +1480,16 @@
       <w:spacing w:after="60" w:before="60" w:line="312" w:lineRule="auto"/>
       <w:ind w:firstLine="0" w:left="283" w:right="170"/>
       <w:pBdr>
-        <w:left w:color="149C8E" w:space="8" w:sz="18" w:val="single"/>
+        <w:left w:color="5F7568" w:space="8" w:sz="18" w:val="single"/>
       </w:pBdr>
-      <w:shd w:color="auto" w:fill="F3F7FA" w:val="clear"/>
+      <w:shd w:color="auto" w:fill="F2F5F3" w:val="clear"/>
     </w:pPr>
     <w:rPr>
       <w:rFonts w:ascii="Times New Roman" w:cs="Times New Roman" w:eastAsia="楷体" w:hAnsi="Times New Roman"/>
       <w:b w:val="0"/>
       <w:i w:val="0"/>
-      <w:color w:val="59607A"/>
-      <w:sz w:val="19"/>
+      <w:color w:val="59606A"/>
+      <w:sz w:val="21"/>
     </w:rPr>
   </w:style>
   <w:style w:styleId="FootnoteText" w:type="paragraph">
@@ -1721,11 +1564,11 @@
       <w:jc w:val="center"/>
     </w:pPr>
     <w:rPr>
-      <w:rFonts w:ascii="Times New Roman" w:cs="Times New Roman" w:eastAsia="楷体" w:hAnsi="Times New Roman"/>
-      <w:b/>
+      <w:rFonts w:ascii="Times New Roman" w:cs="Times New Roman" w:eastAsia="宋体" w:hAnsi="Times New Roman"/>
+      <w:b w:val="0"/>
       <w:i w:val="0"/>
-      <w:color w:val="2B334D"/>
-      <w:sz w:val="19"/>
+      <w:color w:val="000000"/>
+      <w:sz w:val="21"/>
     </w:rPr>
   </w:style>
   <w:style w:customStyle="1" w:styleId="TableCaption" w:type="paragraph">
@@ -1738,11 +1581,11 @@
       <w:jc w:val="center"/>
     </w:pPr>
     <w:rPr>
-      <w:rFonts w:ascii="Times New Roman" w:cs="Times New Roman" w:eastAsia="楷体" w:hAnsi="Times New Roman"/>
-      <w:b/>
+      <w:rFonts w:ascii="Times New Roman" w:cs="Times New Roman" w:eastAsia="宋体" w:hAnsi="Times New Roman"/>
+      <w:b w:val="0"/>
       <w:i w:val="0"/>
-      <w:color w:val="2B334D"/>
-      <w:sz w:val="19"/>
+      <w:color w:val="000000"/>
+      <w:sz w:val="21"/>
     </w:rPr>
   </w:style>
   <w:style w:customStyle="1" w:styleId="ImageCaption" w:type="paragraph">
@@ -1755,11 +1598,11 @@
       <w:jc w:val="center"/>
     </w:pPr>
     <w:rPr>
-      <w:rFonts w:ascii="Times New Roman" w:cs="Times New Roman" w:eastAsia="楷体" w:hAnsi="Times New Roman"/>
-      <w:b/>
+      <w:rFonts w:ascii="Times New Roman" w:cs="Times New Roman" w:eastAsia="宋体" w:hAnsi="Times New Roman"/>
+      <w:b w:val="0"/>
       <w:i w:val="0"/>
-      <w:color w:val="2B334D"/>
-      <w:sz w:val="19"/>
+      <w:color w:val="000000"/>
+      <w:sz w:val="21"/>
     </w:rPr>
   </w:style>
   <w:style w:customStyle="1" w:styleId="Figure" w:type="paragraph">
@@ -1775,7 +1618,7 @@
       <w:rFonts w:ascii="Times New Roman" w:cs="Times New Roman" w:eastAsia="宋体" w:hAnsi="Times New Roman"/>
       <w:b w:val="0"/>
       <w:i w:val="0"/>
-      <w:sz w:val="21"/>
+      <w:sz w:val="24"/>
     </w:rPr>
   </w:style>
   <w:style w:customStyle="1" w:styleId="CaptionedFigure" w:type="paragraph">
@@ -1791,7 +1634,7 @@
       <w:rFonts w:ascii="Times New Roman" w:cs="Times New Roman" w:eastAsia="宋体" w:hAnsi="Times New Roman"/>
       <w:b w:val="0"/>
       <w:i w:val="0"/>
-      <w:sz w:val="21"/>
+      <w:sz w:val="24"/>
     </w:rPr>
   </w:style>
   <w:style w:customStyle="1" w:styleId="BodyTextChar" w:type="character">
@@ -1804,7 +1647,7 @@
     <w:basedOn w:val="BodyTextChar"/>
     <w:rPr>
       <w:rFonts w:ascii="Consolas" w:cs="Consolas" w:eastAsia="宋体" w:hAnsi="Consolas"/>
-      <w:sz w:val="18"/>
+      <w:sz w:val="19"/>
     </w:rPr>
   </w:style>
   <w:style w:customStyle="1" w:styleId="SectionNumber" w:type="character">
@@ -1822,7 +1665,7 @@
     <w:name w:val="Hyperlink"/>
     <w:basedOn w:val="BodyTextChar"/>
     <w:rPr>
-      <w:color w:val="1B3FB0"/>
+      <w:color w:val="000000"/>
     </w:rPr>
   </w:style>
   <w:style w:styleId="TOCHeading" w:type="paragraph">
@@ -1833,14 +1676,19 @@
     <w:unhideWhenUsed/>
     <w:qFormat/>
     <w:pPr>
-      <w:spacing w:before="240" w:line="259" w:lineRule="auto"/>
+      <w:keepNext w:val="0"/>
+      <w:spacing w:after="240" w:before="0" w:line="288" w:lineRule="auto"/>
+      <w:ind w:firstLine="0"/>
+      <w:jc w:val="center"/>
       <w:outlineLvl w:val="9"/>
     </w:pPr>
     <w:rPr>
-      <w:rFonts w:asciiTheme="majorHAnsi" w:cstheme="majorBidi" w:eastAsiaTheme="majorEastAsia" w:hAnsiTheme="majorHAnsi"/>
-      <w:b w:val="0"/>
+      <w:rFonts w:ascii="Times New Roman" w:cs="Times New Roman" w:eastAsia="黑体" w:hAnsi="Times New Roman"/>
+      <w:b/>
       <w:bCs w:val="0"/>
-      <w:color w:themeColor="accent1" w:themeShade="BF" w:val="365F91"/>
+      <w:i w:val="0"/>
+      <w:color w:val="000000"/>
+      <w:sz w:val="32"/>
     </w:rPr>
   </w:style>
   <w:style w:customStyle="1" w:styleId="Heading1" w:type="paragraph">
@@ -1848,17 +1696,14 @@
     <w:basedOn w:val="Normal"/>
     <w:pPr>
       <w:keepNext/>
-      <w:spacing w:after="120" w:before="320" w:line="288" w:lineRule="auto"/>
-      <w:pBdr>
-        <w:bottom w:color="149C8E" w:space="3" w:sz="8" w:val="single"/>
-      </w:pBdr>
+      <w:spacing w:after="160" w:before="360" w:line="288" w:lineRule="auto"/>
     </w:pPr>
     <w:rPr>
       <w:rFonts w:ascii="Times New Roman" w:cs="Times New Roman" w:eastAsia="黑体" w:hAnsi="Times New Roman"/>
       <w:b/>
       <w:i w:val="0"/>
-      <w:color w:val="081650"/>
-      <w:sz w:val="28"/>
+      <w:color w:val="000000"/>
+      <w:sz w:val="32"/>
     </w:rPr>
   </w:style>
   <w:style w:customStyle="1" w:styleId="Heading2" w:type="paragraph">
@@ -1866,14 +1711,14 @@
     <w:basedOn w:val="Normal"/>
     <w:pPr>
       <w:keepNext/>
-      <w:spacing w:after="80" w:before="200" w:line="288" w:lineRule="auto"/>
+      <w:spacing w:after="120" w:before="240" w:line="288" w:lineRule="auto"/>
     </w:pPr>
     <w:rPr>
       <w:rFonts w:ascii="Times New Roman" w:cs="Times New Roman" w:eastAsia="黑体" w:hAnsi="Times New Roman"/>
       <w:b/>
       <w:i w:val="0"/>
-      <w:color w:val="1B3FB0"/>
-      <w:sz w:val="24"/>
+      <w:color w:val="000000"/>
+      <w:sz w:val="28"/>
     </w:rPr>
   </w:style>
   <w:style w:customStyle="1" w:styleId="Heading3" w:type="paragraph">
@@ -1881,14 +1726,14 @@
     <w:basedOn w:val="Normal"/>
     <w:pPr>
       <w:keepNext/>
-      <w:spacing w:after="60" w:before="160" w:line="288" w:lineRule="auto"/>
+      <w:spacing w:after="80" w:before="160" w:line="288" w:lineRule="auto"/>
     </w:pPr>
     <w:rPr>
       <w:rFonts w:ascii="Times New Roman" w:cs="Times New Roman" w:eastAsia="黑体" w:hAnsi="Times New Roman"/>
       <w:b/>
       <w:i w:val="0"/>
-      <w:color w:val="2B334D"/>
-      <w:sz w:val="22"/>
+      <w:color w:val="000000"/>
+      <w:sz w:val="24"/>
     </w:rPr>
   </w:style>
   <w:style w:customStyle="1" w:styleId="Heading4" w:type="paragraph">
@@ -1897,30 +1742,30 @@
     <w:pPr>
       <w:keepNext/>
       <w:spacing w:after="40" w:before="120" w:line="288" w:lineRule="auto"/>
+    </w:pPr>
+    <w:rPr>
+      <w:rFonts w:ascii="Times New Roman" w:cs="Times New Roman" w:eastAsia="黑体" w:hAnsi="Times New Roman"/>
+      <w:b w:val="0"/>
+      <w:i w:val="0"/>
+      <w:color w:val="000000"/>
+      <w:sz w:val="24"/>
+    </w:rPr>
+  </w:style>
+  <w:style w:customStyle="1" w:styleId="ReportTitle" w:type="paragraph">
+    <w:name w:val="ReportTitle"/>
+    <w:basedOn w:val="Normal"/>
+    <w:pPr>
+      <w:keepNext w:val="0"/>
+      <w:spacing w:after="120" w:before="0" w:line="300" w:lineRule="auto"/>
+      <w:ind w:firstLine="0"/>
+      <w:jc w:val="center"/>
     </w:pPr>
     <w:rPr>
       <w:rFonts w:ascii="Times New Roman" w:cs="Times New Roman" w:eastAsia="黑体" w:hAnsi="Times New Roman"/>
       <w:b/>
       <w:i w:val="0"/>
-      <w:color w:val="59607A"/>
-      <w:sz w:val="21"/>
-    </w:rPr>
-  </w:style>
-  <w:style w:customStyle="1" w:styleId="ReportTitle" w:type="paragraph">
-    <w:name w:val="ReportTitle"/>
-    <w:basedOn w:val="Normal"/>
-    <w:pPr>
-      <w:keepNext w:val="0"/>
-      <w:spacing w:after="80" w:before="0" w:line="300" w:lineRule="auto"/>
-      <w:ind w:firstLine="0"/>
-      <w:jc w:val="center"/>
-    </w:pPr>
-    <w:rPr>
-      <w:rFonts w:ascii="Times New Roman" w:cs="Times New Roman" w:eastAsia="黑体" w:hAnsi="Times New Roman"/>
-      <w:b/>
-      <w:i w:val="0"/>
-      <w:color w:val="081650"/>
-      <w:sz w:val="36"/>
+      <w:color w:val="000000"/>
+      <w:sz w:val="44"/>
     </w:rPr>
   </w:style>
   <w:style w:customStyle="1" w:styleId="ReportMeta" w:type="paragraph">
@@ -1931,15 +1776,12 @@
       <w:spacing w:after="0" w:before="0" w:line="336" w:lineRule="auto"/>
       <w:ind w:firstLine="0"/>
       <w:jc w:val="center"/>
-      <w:pBdr>
-        <w:bottom w:color="D5DBEE" w:space="6" w:sz="6" w:val="single"/>
-      </w:pBdr>
     </w:pPr>
     <w:rPr>
       <w:rFonts w:ascii="Times New Roman" w:cs="Times New Roman" w:eastAsia="楷体" w:hAnsi="Times New Roman"/>
       <w:b w:val="0"/>
       <w:i w:val="0"/>
-      <w:color w:val="59607A"/>
+      <w:color w:val="59606A"/>
       <w:sz w:val="21"/>
     </w:rPr>
   </w:style>

</xml_diff>